<commit_message>
Paper revision: review fixes to v4 (abstract, stale sentences, adjudication)
- Label integrity: tickets_AW/SP.csv match AW's pre-cross-labelling
  backups row for row; the only differences are 10 case-only
  none -> NONE cells. Recorded in RESULTS_FOR_PAPER.md.
- adjudication.csv: AW007 and SP007 reasons corrected by AW (no label
  changed); eval_independent.py re-run, summary byte-identical.
- v4: abstract rewritten to 240 words (build fails above 240) and kept
  bold; the three stale sentences in II, VIII and IX now state the 108
  hand-written and 583 real tickets (two teams, offline, no live
  deployment), numbers read from the result files.
- RESULTS_FOR_PAPER.md: measured layout (main text + references end at
  the foot of page 8; 9 pages total) and a list of proposed cuts, not
  applied.

v3 unchanged. No threshold, model, existing result file or tag changed.
456 tests pass.

Co-Authored-By: Claude Opus 5.5 <noreply@anthropic.com>
</commit_message>
<xml_diff>
--- a/paper_docx/Calibrated_Escalation_IT_Ticket_Triage_v4.docx
+++ b/paper_docx/Calibrated_Escalation_IT_Ticket_Triage_v4.docx
@@ -178,25 +178,7 @@
           <w:sz w:val="18"/>
           <w:szCs w:val="18"/>
         </w:rPr>
-        <w:t xml:space="preserve">Automatic triage of IT support tickets has to do two things: send each ticket to the right team, and recognise when it should not act on its own and should pass the ticket to a person. This paper builds a triage pipeline around the second requirement. Two escalation gates are calibrated separately. A confidence threshold of 0.50 on a fast lexical classifier decides whether its label is trusted or a slower embedding classifier is consulted, and a cosine-similarity threshold of 0.67 on retrieved past tickets decides whether a language model may draft a resolution or the ticket goes to a human. On a 9-ticket adversarial set the retrieval gate makes the correct decision for every ticket, compared with 3 of 9 when it is removed. A zero-shot LLM classifies more accurately than our trained classifier (40/45 against 33/45) but provides no abstention mechanism and no cost control, so we report it as a baseline rather than as the design. Across coverage guarantees, drift monitoring and classification, one pattern repeats: the data a component is trained or calibrated on limits it more than the method chosen. We also report negative results, an error analysis of misrouting, wrong escalations and unsupported drafts, and the configuration needed to reproduce every number. </w:t>
-      </w:r>
-      <w:r>
-        <w:rPr>
-          <w:rFonts w:ascii="Times New Roman" w:cs="Times New Roman" w:eastAsia="Times New Roman" w:hAnsi="Times New Roman"/>
-          <w:sz w:val="18"/>
-          <w:szCs w:val="18"/>
-        </w:rPr>
-        <w:t xml:space="preserve">On 108 tickets written and cross-labelled blind by two of the authors (Cohen's κ = 0.936 for category), the cascade routed 74 of the 98 tickets that belong to a team correctly, similar to the out-of-template benchmark, and the retrieval gate escalated 40 of 108, including 32 actionable tickets. On 583 distinct real user tickets from a public dataset, covering two of the seven teams, the pipeline routed 19.7% correctly (119 of all 984 tickets), indistinguishable from Tier 2 alone (p = 1.0). Accuracy rises to 50.4% if file-share requests are mapped to a different team. Tier 1 answered 238 tickets but only 39 correctly, and the retrieval gate escalated 22.1% but let 371 of 468 misrouted tickets reach the drafter, so a classifier trained only on synthetic templates does not transfer to real tickets.</w:t>
-      </w:r>
-      <w:r>
-        <w:rPr>
-          <w:rFonts w:ascii="Times New Roman" w:cs="Times New Roman" w:eastAsia="Times New Roman" w:hAnsi="Times New Roman"/>
-          <w:b/>
-          <w:bCs/>
-          <w:sz w:val="18"/>
-          <w:szCs w:val="18"/>
-        </w:rPr>
-        <w:t xml:space="preserve"> The main corpus is synthetic and the evaluation sets are small, and all conclusions are scoped accordingly.</w:t>
+        <w:t xml:space="preserve">A triage system for IT support tickets must route each ticket to the right team and recognise when to hand it to a person. Our pipeline has two separately calibrated escalation gates: a 0.50 confidence threshold on a fast lexical classifier decides whether a slower embedding classifier is consulted, and a 0.67 cosine-similarity threshold on retrieved past tickets decides whether a language model may draft a resolution. On a 9-ticket adversarial set the retrieval gate decides every ticket correctly, against 3 of 9 without it. A zero-shot LLM classifies more accurately (40/45 against 33/45) but cannot abstain, so it is reported as a baseline. On 108 tickets written and cross-labelled by two authors (κ = 0.936), the cascade routes 74 of 98 correctly, but the retrieval gate also escalates 32 actionable tickets. On 583 distinct real tickets from a public dataset, covering two of seven teams, it routes 19.7% correctly (119 of all 984), indistinguishable from Tier 2 alone (p = 1.0), or 50.4% under an alternative category mapping; Tier 1 answers 238 of them with 39 correct, and 371 of 468 misrouted tickets still reach the drafter. One pattern repeats across experiments: the data a component is trained or calibrated on limits it more than the method chosen, and a classifier trained only on synthetic templates does not transfer to real tickets. We report negative results, an error analysis and reproduction steps; conclusions are scoped to small evaluation sets.</w:t>
       </w:r>
     </w:p>
     <w:p>
@@ -590,7 +572,7 @@
           <w:sz w:val="20"/>
           <w:szCs w:val="20"/>
         </w:rPr>
-        <w:t xml:space="preserve"> Table I summarises the closest works using only what each abstract reports. Two of the ticket-triage studies evaluate on real tickets, while our main evaluation does not (Section VIII). None of them combines escalation gates calibrated on measured data with generation that is permitted only after retrieval passes such a gate.</w:t>
+        <w:t xml:space="preserve"> Table I summarises the closest works using only what each abstract reports. Two of the ticket-triage studies evaluate on real tickets, while our main evaluation is synthetic, supplemented by 108 hand-written tickets and 583 real tickets that cover only two of our seven teams (Section VI-E). None of them combines escalation gates calibrated on measured data with generation that is permitted only after retrieval passes such a gate.</w:t>
       </w:r>
     </w:p>
     <w:p>
@@ -11883,7 +11865,7 @@
           <w:sz w:val="20"/>
           <w:szCs w:val="20"/>
         </w:rPr>
-        <w:t xml:space="preserve"> No real ticket stream has passed through the system and no help-desk user has acted on its output, so its effect on resolution time, misrouting cost and user trust is unmeasured, and the drift monitor has no reference built from deployment traffic. Resolution quality rests on human labels for only 33 drafts; it could not be scaled with an LLM judge, whose 30/33 raw agreement concealed a Cohen's </w:t>
+        <w:t xml:space="preserve"> The system has not been deployed: 583 real tickets were routed offline, but no live ticket stream has passed through it and no help-desk user has acted on its output, so its effect on resolution time, misrouting cost and user trust is unmeasured, and the drift monitor has no reference built from deployment traffic. Resolution quality rests on human labels for only 33 drafts; it could not be scaled with an LLM judge, whose 30/33 raw agreement concealed a Cohen's </w:t>
       </w:r>
       <w:r>
         <w:rPr>
@@ -11955,7 +11937,7 @@
           <w:sz w:val="20"/>
           <w:szCs w:val="20"/>
         </w:rPr>
-        <w:t xml:space="preserve">These conclusions are established on a synthetic corpus and small, mostly LLM-generated evaluation sets, and they should not be read as performance claims for a production help desk. </w:t>
+        <w:t xml:space="preserve">These conclusions are established on a synthetic corpus, small LLM-generated evaluation sets, 108 hand-written tickets and 583 real tickets that cover only two of the seven teams, and they should not be read as performance claims for a production help desk. </w:t>
       </w:r>
       <w:r>
         <w:rPr>

</xml_diff>

<commit_message>
Paper revision: apply length cuts 1, 4, 7, 8 (fold) and 9 to v4
- Table IV -> Appendix D; Table II -> Appendix E; "Methodological
  lessons" -> Appendix F. Content moved verbatim, table numbers kept,
  citing text updated ("Table IV (Appendix D)", "Table II (Appendix E)",
  pointer to Appendix F in VI-F).
- III-F folded into one sentence in III-A; III-G relettered to F.
- Fig. 1 scaled to 85%. Table III kept in one column (keep-with-next).
- Cuts 2, 3, 5 and 6 not applied.
- Build now checks that every cited Table, Fig., Appendix and Section
  exists and that no "??" or "Error! Reference" text appears.
- Word: 9 pages; main text + references now ~7.6 pages (was ~8.0).

v3 unchanged. No threshold, model, existing result file or tag changed.
456 tests pass.

Co-Authored-By: Claude Opus 5.5 <noreply@anthropic.com>
</commit_message>
<xml_diff>
--- a/paper_docx/Calibrated_Escalation_IT_Ticket_Triage_v4.docx
+++ b/paper_docx/Calibrated_Escalation_IT_Ticket_Triage_v4.docx
@@ -1955,7 +1955,7 @@
       <w:r>
         <w:drawing>
           <wp:inline distT="0" distB="0" distL="0" distR="0">
-            <wp:extent cx="5715000" cy="2533650"/>
+            <wp:extent cx="4857750" cy="2153602"/>
             <wp:effectExtent t="0" r="0" b="0" l="0"/>
             <wp:docPr id="1" name="fig1_pipeline.png" descr="fig1_pipeline.png" title="fig1_pipeline.png"/>
             <wp:cNvGraphicFramePr>
@@ -1980,7 +1980,7 @@
                   <pic:spPr bwMode="auto">
                     <a:xfrm>
                       <a:off x="0" y="0"/>
-                      <a:ext cx="5715000" cy="2533650"/>
+                      <a:ext cx="4857750" cy="2153602"/>
                     </a:xfrm>
                     <a:prstGeom prst="rect">
                       <a:avLst/>
@@ -2078,7 +2078,7 @@
           <w:sz w:val="20"/>
           <w:szCs w:val="20"/>
         </w:rPr>
-        <w:t xml:space="preserve">Fig. 1 shows the pipeline. It is a sequential pipeline with clear agent boundaries and an HTTP interface, not a distributed or autonomous multi-agent system. Each stage (classify, retrieve, resolve) is an agent that declares the artifacts it needs, checks them when it is created, and makes no routing decision itself. All routing decisions are taken by one orchestrator, which records a trace for every stage, including the stages it skipped; a skipped resolution step is therefore direct evidence that no language model was called. Each stage can be called separately over HTTP, but the triage endpoint runs them in-process, so the measured latency contains no network hops. If a stage fails, the ticket is escalated instead of returning a server error, because a failed ticket needs a person rather than a retry.</w:t>
+        <w:t xml:space="preserve">Fig. 1 shows the pipeline. It is a sequential pipeline with clear agent boundaries and an HTTP interface, not a distributed or autonomous multi-agent system. Each stage (classify, retrieve, resolve) is an agent that declares the artifacts it needs, checks them when it is created, and makes no routing decision itself. All routing decisions are taken by one orchestrator, which records a trace for every stage, including the stages it skipped; a skipped resolution step is therefore direct evidence that no language model was called. Each stage can be called separately over HTTP, but the triage endpoint runs them in-process, so the measured latency contains no network hops. If a stage fails, the ticket is escalated instead of returning a server error, because a failed ticket needs a person rather than a retry. An offline job also clusters resolved tickets by the similarity of their resolution text at a threshold of 0.80 and shows recurring clusters to a reviewer as candidates for automation.</w:t>
       </w:r>
     </w:p>
     <w:p>
@@ -2236,7 +2236,7 @@
           <w:sz w:val="20"/>
           <w:szCs w:val="20"/>
         </w:rPr>
-        <w:t xml:space="preserve">F. Automation candidates</w:t>
+        <w:t xml:space="preserve">F. Verification</w:t>
       </w:r>
     </w:p>
     <w:p>
@@ -2251,688 +2251,8 @@
           <w:sz w:val="20"/>
           <w:szCs w:val="20"/>
         </w:rPr>
-        <w:t xml:space="preserve">An offline job clusters resolved tickets by the similarity of their resolution text at a threshold of 0.80 and shows recurring clusters to a reviewer as candidates for automation.</w:t>
-      </w:r>
-    </w:p>
-    <w:p>
-      <w:pPr>
-        <w:keepNext/>
-        <w:spacing w:after="60" w:before="120"/>
-      </w:pPr>
-      <w:r>
-        <w:rPr>
-          <w:rFonts w:ascii="Times New Roman" w:cs="Times New Roman" w:eastAsia="Times New Roman" w:hAnsi="Times New Roman"/>
-          <w:i/>
-          <w:iCs/>
-          <w:sz w:val="20"/>
-          <w:szCs w:val="20"/>
-        </w:rPr>
-        <w:t xml:space="preserve">G. Verification</w:t>
-      </w:r>
-    </w:p>
-    <w:p>
-      <w:pPr>
-        <w:spacing w:after="0" w:line="228"/>
-        <w:ind w:firstLine="245"/>
-        <w:jc w:val="both"/>
-      </w:pPr>
-      <w:r>
-        <w:rPr>
-          <w:rFonts w:ascii="Times New Roman" w:cs="Times New Roman" w:eastAsia="Times New Roman" w:hAnsi="Times New Roman"/>
-          <w:sz w:val="20"/>
-          <w:szCs w:val="20"/>
-        </w:rPr>
-        <w:t xml:space="preserve">A value that is wrong for its context but internally consistent can produce a wrong result without raising any error. The checks in Table II therefore run before any result is accepted. Routing decisions are compared exactly, and floating-point values are compared within tolerances derived from their arithmetic.</w:t>
-      </w:r>
-    </w:p>
-    <w:p>
-      <w:pPr>
-        <w:keepNext/>
-        <w:spacing w:after="0" w:before="160"/>
-        <w:jc w:val="center"/>
-      </w:pPr>
-      <w:r>
-        <w:rPr>
-          <w:rFonts w:ascii="Times New Roman" w:cs="Times New Roman" w:eastAsia="Times New Roman" w:hAnsi="Times New Roman"/>
-          <w:sz w:val="16"/>
-          <w:szCs w:val="16"/>
-        </w:rPr>
-        <w:t xml:space="preserve">TABLE II</w:t>
-      </w:r>
-    </w:p>
-    <w:p>
-      <w:pPr>
-        <w:keepNext/>
-        <w:spacing w:after="80"/>
-        <w:jc w:val="center"/>
-      </w:pPr>
-      <w:r>
-        <w:rPr>
-          <w:rFonts w:ascii="Times New Roman" w:cs="Times New Roman" w:eastAsia="Times New Roman" w:hAnsi="Times New Roman"/>
-          <w:smallCaps/>
-          <w:sz w:val="16"/>
-          <w:szCs w:val="16"/>
-        </w:rPr>
-        <w:t xml:space="preserve">Checks that run before a result is accepted. A count is given only where a committed file records it</w:t>
-      </w:r>
-    </w:p>
-    <w:tbl>
-      <w:tblPr>
-        <w:tblW w:type="dxa" w:w="4850"/>
-        <w:jc w:val="center"/>
-        <w:tblBorders>
-          <w:top w:val="none" w:color="FFFFFF" w:sz="0"/>
-          <w:left w:val="none" w:color="FFFFFF" w:sz="0"/>
-          <w:bottom w:val="none" w:color="FFFFFF" w:sz="0"/>
-          <w:right w:val="none" w:color="FFFFFF" w:sz="0"/>
-          <w:insideH w:val="none" w:color="FFFFFF" w:sz="0"/>
-          <w:insideV w:val="none" w:color="FFFFFF" w:sz="0"/>
-        </w:tblBorders>
-      </w:tblPr>
-      <w:tblGrid>
-        <w:gridCol w:w="1150"/>
-        <w:gridCol w:w="2850"/>
-        <w:gridCol w:w="850"/>
-      </w:tblGrid>
-      <w:tr>
-        <w:trPr>
-          <w:tblHeader/>
-        </w:trPr>
-        <w:tc>
-          <w:tcPr>
-            <w:tcW w:type="dxa" w:w="1150"/>
-            <w:tcBorders>
-              <w:top w:val="single" w:color="000000" w:sz="8"/>
-              <w:left w:val="none" w:color="FFFFFF" w:sz="0"/>
-              <w:bottom w:val="single" w:color="000000" w:sz="4"/>
-              <w:right w:val="none" w:color="FFFFFF" w:sz="0"/>
-            </w:tcBorders>
-            <w:tcMar>
-              <w:top w:type="dxa" w:w="30"/>
-              <w:left w:type="dxa" w:w="70"/>
-              <w:bottom w:type="dxa" w:w="30"/>
-              <w:right w:type="dxa" w:w="70"/>
-            </w:tcMar>
-            <w:vAlign w:val="top"/>
-          </w:tcPr>
-          <w:p>
-            <w:pPr>
-              <w:spacing w:after="0"/>
-            </w:pPr>
-            <w:r>
-              <w:rPr>
-                <w:rFonts w:ascii="Times New Roman" w:cs="Times New Roman" w:eastAsia="Times New Roman" w:hAnsi="Times New Roman"/>
-                <w:b/>
-                <w:bCs/>
-                <w:sz w:val="15"/>
-                <w:szCs w:val="15"/>
-              </w:rPr>
-              <w:t xml:space="preserve">Check</w:t>
-            </w:r>
-          </w:p>
-        </w:tc>
-        <w:tc>
-          <w:tcPr>
-            <w:tcW w:type="dxa" w:w="2850"/>
-            <w:tcBorders>
-              <w:top w:val="single" w:color="000000" w:sz="8"/>
-              <w:left w:val="none" w:color="FFFFFF" w:sz="0"/>
-              <w:bottom w:val="single" w:color="000000" w:sz="4"/>
-              <w:right w:val="none" w:color="FFFFFF" w:sz="0"/>
-            </w:tcBorders>
-            <w:tcMar>
-              <w:top w:type="dxa" w:w="30"/>
-              <w:left w:type="dxa" w:w="70"/>
-              <w:bottom w:type="dxa" w:w="30"/>
-              <w:right w:type="dxa" w:w="70"/>
-            </w:tcMar>
-            <w:vAlign w:val="top"/>
-          </w:tcPr>
-          <w:p>
-            <w:pPr>
-              <w:spacing w:after="0"/>
-            </w:pPr>
-            <w:r>
-              <w:rPr>
-                <w:rFonts w:ascii="Times New Roman" w:cs="Times New Roman" w:eastAsia="Times New Roman" w:hAnsi="Times New Roman"/>
-                <w:b/>
-                <w:bCs/>
-                <w:sz w:val="15"/>
-                <w:szCs w:val="15"/>
-              </w:rPr>
-              <w:t xml:space="preserve">What it guards</w:t>
-            </w:r>
-          </w:p>
-        </w:tc>
-        <w:tc>
-          <w:tcPr>
-            <w:tcW w:type="dxa" w:w="850"/>
-            <w:tcBorders>
-              <w:top w:val="single" w:color="000000" w:sz="8"/>
-              <w:left w:val="none" w:color="FFFFFF" w:sz="0"/>
-              <w:bottom w:val="single" w:color="000000" w:sz="4"/>
-              <w:right w:val="none" w:color="FFFFFF" w:sz="0"/>
-            </w:tcBorders>
-            <w:tcMar>
-              <w:top w:type="dxa" w:w="30"/>
-              <w:left w:type="dxa" w:w="70"/>
-              <w:bottom w:type="dxa" w:w="30"/>
-              <w:right w:type="dxa" w:w="70"/>
-            </w:tcMar>
-            <w:vAlign w:val="top"/>
-          </w:tcPr>
-          <w:p>
-            <w:pPr>
-              <w:spacing w:after="0"/>
-            </w:pPr>
-            <w:r>
-              <w:rPr>
-                <w:rFonts w:ascii="Times New Roman" w:cs="Times New Roman" w:eastAsia="Times New Roman" w:hAnsi="Times New Roman"/>
-                <w:b/>
-                <w:bCs/>
-                <w:sz w:val="15"/>
-                <w:szCs w:val="15"/>
-              </w:rPr>
-              <w:t xml:space="preserve">Count</w:t>
-            </w:r>
-          </w:p>
-        </w:tc>
-      </w:tr>
-      <w:tr>
-        <w:trPr>
-          <w:tblHeader w:val="false"/>
-        </w:trPr>
-        <w:tc>
-          <w:tcPr>
-            <w:tcW w:type="dxa" w:w="1150"/>
-            <w:tcBorders>
-              <w:top w:val="none" w:color="FFFFFF" w:sz="0"/>
-              <w:left w:val="none" w:color="FFFFFF" w:sz="0"/>
-              <w:bottom w:val="none" w:color="FFFFFF" w:sz="0"/>
-              <w:right w:val="none" w:color="FFFFFF" w:sz="0"/>
-            </w:tcBorders>
-            <w:tcMar>
-              <w:top w:type="dxa" w:w="30"/>
-              <w:left w:type="dxa" w:w="70"/>
-              <w:bottom w:type="dxa" w:w="30"/>
-              <w:right w:type="dxa" w:w="70"/>
-            </w:tcMar>
-            <w:vAlign w:val="top"/>
-          </w:tcPr>
-          <w:p>
-            <w:pPr>
-              <w:spacing w:after="0"/>
-            </w:pPr>
-            <w:r>
-              <w:rPr>
-                <w:rFonts w:ascii="Times New Roman" w:cs="Times New Roman" w:eastAsia="Times New Roman" w:hAnsi="Times New Roman"/>
-                <w:sz w:val="15"/>
-                <w:szCs w:val="15"/>
-              </w:rPr>
-              <w:t xml:space="preserve">Golden parity</w:t>
-            </w:r>
-          </w:p>
-        </w:tc>
-        <w:tc>
-          <w:tcPr>
-            <w:tcW w:type="dxa" w:w="2850"/>
-            <w:tcBorders>
-              <w:top w:val="none" w:color="FFFFFF" w:sz="0"/>
-              <w:left w:val="none" w:color="FFFFFF" w:sz="0"/>
-              <w:bottom w:val="none" w:color="FFFFFF" w:sz="0"/>
-              <w:right w:val="none" w:color="FFFFFF" w:sz="0"/>
-            </w:tcBorders>
-            <w:tcMar>
-              <w:top w:type="dxa" w:w="30"/>
-              <w:left w:type="dxa" w:w="70"/>
-              <w:bottom w:type="dxa" w:w="30"/>
-              <w:right w:type="dxa" w:w="70"/>
-            </w:tcMar>
-            <w:vAlign w:val="top"/>
-          </w:tcPr>
-          <w:p>
-            <w:pPr>
-              <w:spacing w:after="0"/>
-            </w:pPr>
-            <w:r>
-              <w:rPr>
-                <w:rFonts w:ascii="Times New Roman" w:cs="Times New Roman" w:eastAsia="Times New Roman" w:hAnsi="Times New Roman"/>
-                <w:sz w:val="15"/>
-                <w:szCs w:val="15"/>
-              </w:rPr>
-              <w:t xml:space="preserve">Category, tier, escalation and neighbour count equal the recorded decisions exactly</w:t>
-            </w:r>
-          </w:p>
-        </w:tc>
-        <w:tc>
-          <w:tcPr>
-            <w:tcW w:type="dxa" w:w="850"/>
-            <w:tcBorders>
-              <w:top w:val="none" w:color="FFFFFF" w:sz="0"/>
-              <w:left w:val="none" w:color="FFFFFF" w:sz="0"/>
-              <w:bottom w:val="none" w:color="FFFFFF" w:sz="0"/>
-              <w:right w:val="none" w:color="FFFFFF" w:sz="0"/>
-            </w:tcBorders>
-            <w:tcMar>
-              <w:top w:type="dxa" w:w="30"/>
-              <w:left w:type="dxa" w:w="70"/>
-              <w:bottom w:type="dxa" w:w="30"/>
-              <w:right w:type="dxa" w:w="70"/>
-            </w:tcMar>
-            <w:vAlign w:val="top"/>
-          </w:tcPr>
-          <w:p>
-            <w:pPr>
-              <w:spacing w:after="0"/>
-            </w:pPr>
-            <w:r>
-              <w:rPr>
-                <w:rFonts w:ascii="Times New Roman" w:cs="Times New Roman" w:eastAsia="Times New Roman" w:hAnsi="Times New Roman"/>
-                <w:sz w:val="15"/>
-                <w:szCs w:val="15"/>
-              </w:rPr>
-              <w:t xml:space="preserve">54 tickets</w:t>
-            </w:r>
-          </w:p>
-        </w:tc>
-      </w:tr>
-      <w:tr>
-        <w:trPr>
-          <w:tblHeader w:val="false"/>
-        </w:trPr>
-        <w:tc>
-          <w:tcPr>
-            <w:tcW w:type="dxa" w:w="1150"/>
-            <w:tcBorders>
-              <w:top w:val="none" w:color="FFFFFF" w:sz="0"/>
-              <w:left w:val="none" w:color="FFFFFF" w:sz="0"/>
-              <w:bottom w:val="none" w:color="FFFFFF" w:sz="0"/>
-              <w:right w:val="none" w:color="FFFFFF" w:sz="0"/>
-            </w:tcBorders>
-            <w:tcMar>
-              <w:top w:type="dxa" w:w="30"/>
-              <w:left w:type="dxa" w:w="70"/>
-              <w:bottom w:type="dxa" w:w="30"/>
-              <w:right w:type="dxa" w:w="70"/>
-            </w:tcMar>
-            <w:vAlign w:val="top"/>
-          </w:tcPr>
-          <w:p>
-            <w:pPr>
-              <w:spacing w:after="0"/>
-            </w:pPr>
-            <w:r>
-              <w:rPr>
-                <w:rFonts w:ascii="Times New Roman" w:cs="Times New Roman" w:eastAsia="Times New Roman" w:hAnsi="Times New Roman"/>
-                <w:sz w:val="15"/>
-                <w:szCs w:val="15"/>
-              </w:rPr>
-              <w:t xml:space="preserve">Adversarial gate</w:t>
-            </w:r>
-          </w:p>
-        </w:tc>
-        <w:tc>
-          <w:tcPr>
-            <w:tcW w:type="dxa" w:w="2850"/>
-            <w:tcBorders>
-              <w:top w:val="none" w:color="FFFFFF" w:sz="0"/>
-              <w:left w:val="none" w:color="FFFFFF" w:sz="0"/>
-              <w:bottom w:val="none" w:color="FFFFFF" w:sz="0"/>
-              <w:right w:val="none" w:color="FFFFFF" w:sz="0"/>
-            </w:tcBorders>
-            <w:tcMar>
-              <w:top w:type="dxa" w:w="30"/>
-              <w:left w:type="dxa" w:w="70"/>
-              <w:bottom w:type="dxa" w:w="30"/>
-              <w:right w:type="dxa" w:w="70"/>
-            </w:tcMar>
-            <w:vAlign w:val="top"/>
-          </w:tcPr>
-          <w:p>
-            <w:pPr>
-              <w:spacing w:after="0"/>
-            </w:pPr>
-            <w:r>
-              <w:rPr>
-                <w:rFonts w:ascii="Times New Roman" w:cs="Times New Roman" w:eastAsia="Times New Roman" w:hAnsi="Times New Roman"/>
-                <w:sz w:val="15"/>
-                <w:szCs w:val="15"/>
-              </w:rPr>
-              <w:t xml:space="preserve">Each adversarial ticket escalates or proceeds as expected</w:t>
-            </w:r>
-          </w:p>
-        </w:tc>
-        <w:tc>
-          <w:tcPr>
-            <w:tcW w:type="dxa" w:w="850"/>
-            <w:tcBorders>
-              <w:top w:val="none" w:color="FFFFFF" w:sz="0"/>
-              <w:left w:val="none" w:color="FFFFFF" w:sz="0"/>
-              <w:bottom w:val="none" w:color="FFFFFF" w:sz="0"/>
-              <w:right w:val="none" w:color="FFFFFF" w:sz="0"/>
-            </w:tcBorders>
-            <w:tcMar>
-              <w:top w:type="dxa" w:w="30"/>
-              <w:left w:type="dxa" w:w="70"/>
-              <w:bottom w:type="dxa" w:w="30"/>
-              <w:right w:type="dxa" w:w="70"/>
-            </w:tcMar>
-            <w:vAlign w:val="top"/>
-          </w:tcPr>
-          <w:p>
-            <w:pPr>
-              <w:spacing w:after="0"/>
-            </w:pPr>
-            <w:r>
-              <w:rPr>
-                <w:rFonts w:ascii="Times New Roman" w:cs="Times New Roman" w:eastAsia="Times New Roman" w:hAnsi="Times New Roman"/>
-                <w:sz w:val="15"/>
-                <w:szCs w:val="15"/>
-              </w:rPr>
-              <w:t xml:space="preserve">9/9</w:t>
-            </w:r>
-          </w:p>
-        </w:tc>
-      </w:tr>
-      <w:tr>
-        <w:trPr>
-          <w:tblHeader w:val="false"/>
-        </w:trPr>
-        <w:tc>
-          <w:tcPr>
-            <w:tcW w:type="dxa" w:w="1150"/>
-            <w:tcBorders>
-              <w:top w:val="none" w:color="FFFFFF" w:sz="0"/>
-              <w:left w:val="none" w:color="FFFFFF" w:sz="0"/>
-              <w:bottom w:val="none" w:color="FFFFFF" w:sz="0"/>
-              <w:right w:val="none" w:color="FFFFFF" w:sz="0"/>
-            </w:tcBorders>
-            <w:tcMar>
-              <w:top w:type="dxa" w:w="30"/>
-              <w:left w:type="dxa" w:w="70"/>
-              <w:bottom w:type="dxa" w:w="30"/>
-              <w:right w:type="dxa" w:w="70"/>
-            </w:tcMar>
-            <w:vAlign w:val="top"/>
-          </w:tcPr>
-          <w:p>
-            <w:pPr>
-              <w:spacing w:after="0"/>
-            </w:pPr>
-            <w:r>
-              <w:rPr>
-                <w:rFonts w:ascii="Times New Roman" w:cs="Times New Roman" w:eastAsia="Times New Roman" w:hAnsi="Times New Roman"/>
-                <w:sz w:val="15"/>
-                <w:szCs w:val="15"/>
-              </w:rPr>
-              <w:t xml:space="preserve">Gate headroom</w:t>
-            </w:r>
-          </w:p>
-        </w:tc>
-        <w:tc>
-          <w:tcPr>
-            <w:tcW w:type="dxa" w:w="2850"/>
-            <w:tcBorders>
-              <w:top w:val="none" w:color="FFFFFF" w:sz="0"/>
-              <w:left w:val="none" w:color="FFFFFF" w:sz="0"/>
-              <w:bottom w:val="none" w:color="FFFFFF" w:sz="0"/>
-              <w:right w:val="none" w:color="FFFFFF" w:sz="0"/>
-            </w:tcBorders>
-            <w:tcMar>
-              <w:top w:type="dxa" w:w="30"/>
-              <w:left w:type="dxa" w:w="70"/>
-              <w:bottom w:type="dxa" w:w="30"/>
-              <w:right w:type="dxa" w:w="70"/>
-            </w:tcMar>
-            <w:vAlign w:val="top"/>
-          </w:tcPr>
-          <w:p>
-            <w:pPr>
-              <w:spacing w:after="0"/>
-            </w:pPr>
-            <w:r>
-              <w:rPr>
-                <w:rFonts w:ascii="Times New Roman" w:cs="Times New Roman" w:eastAsia="Times New Roman" w:hAnsi="Times New Roman"/>
-                <w:sz w:val="15"/>
-                <w:szCs w:val="15"/>
-              </w:rPr>
-              <w:t xml:space="preserve">No golden similarity lies within its tolerance of the gate; closest, as a multiple of the tolerance</w:t>
-            </w:r>
-          </w:p>
-        </w:tc>
-        <w:tc>
-          <w:tcPr>
-            <w:tcW w:type="dxa" w:w="850"/>
-            <w:tcBorders>
-              <w:top w:val="none" w:color="FFFFFF" w:sz="0"/>
-              <w:left w:val="none" w:color="FFFFFF" w:sz="0"/>
-              <w:bottom w:val="none" w:color="FFFFFF" w:sz="0"/>
-              <w:right w:val="none" w:color="FFFFFF" w:sz="0"/>
-            </w:tcBorders>
-            <w:tcMar>
-              <w:top w:type="dxa" w:w="30"/>
-              <w:left w:type="dxa" w:w="70"/>
-              <w:bottom w:type="dxa" w:w="30"/>
-              <w:right w:type="dxa" w:w="70"/>
-            </w:tcMar>
-            <w:vAlign w:val="top"/>
-          </w:tcPr>
-          <w:p>
-            <w:pPr>
-              <w:spacing w:after="0"/>
-            </w:pPr>
-            <w:r>
-              <w:rPr>
-                <w:rFonts w:ascii="Times New Roman" w:cs="Times New Roman" w:eastAsia="Times New Roman" w:hAnsi="Times New Roman"/>
-                <w:sz w:val="15"/>
-                <w:szCs w:val="15"/>
-              </w:rPr>
-              <w:t xml:space="preserve">3.18×</w:t>
-            </w:r>
-          </w:p>
-        </w:tc>
-      </w:tr>
-      <w:tr>
-        <w:trPr>
-          <w:tblHeader w:val="false"/>
-        </w:trPr>
-        <w:tc>
-          <w:tcPr>
-            <w:tcW w:type="dxa" w:w="1150"/>
-            <w:tcBorders>
-              <w:top w:val="none" w:color="FFFFFF" w:sz="0"/>
-              <w:left w:val="none" w:color="FFFFFF" w:sz="0"/>
-              <w:bottom w:val="none" w:color="FFFFFF" w:sz="0"/>
-              <w:right w:val="none" w:color="FFFFFF" w:sz="0"/>
-            </w:tcBorders>
-            <w:tcMar>
-              <w:top w:type="dxa" w:w="30"/>
-              <w:left w:type="dxa" w:w="70"/>
-              <w:bottom w:type="dxa" w:w="30"/>
-              <w:right w:type="dxa" w:w="70"/>
-            </w:tcMar>
-            <w:vAlign w:val="top"/>
-          </w:tcPr>
-          <w:p>
-            <w:pPr>
-              <w:spacing w:after="0"/>
-            </w:pPr>
-            <w:r>
-              <w:rPr>
-                <w:rFonts w:ascii="Times New Roman" w:cs="Times New Roman" w:eastAsia="Times New Roman" w:hAnsi="Times New Roman"/>
-                <w:sz w:val="15"/>
-                <w:szCs w:val="15"/>
-              </w:rPr>
-              <w:t xml:space="preserve">Artifact guards</w:t>
-            </w:r>
-          </w:p>
-        </w:tc>
-        <w:tc>
-          <w:tcPr>
-            <w:tcW w:type="dxa" w:w="2850"/>
-            <w:tcBorders>
-              <w:top w:val="none" w:color="FFFFFF" w:sz="0"/>
-              <w:left w:val="none" w:color="FFFFFF" w:sz="0"/>
-              <w:bottom w:val="none" w:color="FFFFFF" w:sz="0"/>
-              <w:right w:val="none" w:color="FFFFFF" w:sz="0"/>
-            </w:tcBorders>
-            <w:tcMar>
-              <w:top w:type="dxa" w:w="30"/>
-              <w:left w:type="dxa" w:w="70"/>
-              <w:bottom w:type="dxa" w:w="30"/>
-              <w:right w:type="dxa" w:w="70"/>
-            </w:tcMar>
-            <w:vAlign w:val="top"/>
-          </w:tcPr>
-          <w:p>
-            <w:pPr>
-              <w:spacing w:after="0"/>
-            </w:pPr>
-            <w:r>
-              <w:rPr>
-                <w:rFonts w:ascii="Times New Roman" w:cs="Times New Roman" w:eastAsia="Times New Roman" w:hAnsi="Times New Roman"/>
-                <w:sz w:val="15"/>
-                <w:szCs w:val="15"/>
-              </w:rPr>
-              <w:t xml:space="preserve">Index and metadata aligned; encoder, index and configured dimension agree; Tier 1 matches its dataset and vocabulary</w:t>
-            </w:r>
-          </w:p>
-        </w:tc>
-        <w:tc>
-          <w:tcPr>
-            <w:tcW w:type="dxa" w:w="850"/>
-            <w:tcBorders>
-              <w:top w:val="none" w:color="FFFFFF" w:sz="0"/>
-              <w:left w:val="none" w:color="FFFFFF" w:sz="0"/>
-              <w:bottom w:val="none" w:color="FFFFFF" w:sz="0"/>
-              <w:right w:val="none" w:color="FFFFFF" w:sz="0"/>
-            </w:tcBorders>
-            <w:tcMar>
-              <w:top w:type="dxa" w:w="30"/>
-              <w:left w:type="dxa" w:w="70"/>
-              <w:bottom w:type="dxa" w:w="30"/>
-              <w:right w:type="dxa" w:w="70"/>
-            </w:tcMar>
-            <w:vAlign w:val="top"/>
-          </w:tcPr>
-          <w:p>
-            <w:pPr>
-              <w:spacing w:after="0"/>
-            </w:pPr>
-            <w:r>
-              <w:rPr>
-                <w:rFonts w:ascii="Times New Roman" w:cs="Times New Roman" w:eastAsia="Times New Roman" w:hAnsi="Times New Roman"/>
-                <w:sz w:val="15"/>
-                <w:szCs w:val="15"/>
-              </w:rPr>
-              <w:t xml:space="preserve">–</w:t>
-            </w:r>
-          </w:p>
-        </w:tc>
-      </w:tr>
-      <w:tr>
-        <w:trPr>
-          <w:tblHeader w:val="false"/>
-        </w:trPr>
-        <w:tc>
-          <w:tcPr>
-            <w:tcW w:type="dxa" w:w="1150"/>
-            <w:tcBorders>
-              <w:top w:val="none" w:color="FFFFFF" w:sz="0"/>
-              <w:left w:val="none" w:color="FFFFFF" w:sz="0"/>
-              <w:bottom w:val="single" w:color="000000" w:sz="8"/>
-              <w:right w:val="none" w:color="FFFFFF" w:sz="0"/>
-            </w:tcBorders>
-            <w:tcMar>
-              <w:top w:type="dxa" w:w="30"/>
-              <w:left w:type="dxa" w:w="70"/>
-              <w:bottom w:type="dxa" w:w="30"/>
-              <w:right w:type="dxa" w:w="70"/>
-            </w:tcMar>
-            <w:vAlign w:val="top"/>
-          </w:tcPr>
-          <w:p>
-            <w:pPr>
-              <w:spacing w:after="0"/>
-            </w:pPr>
-            <w:r>
-              <w:rPr>
-                <w:rFonts w:ascii="Times New Roman" w:cs="Times New Roman" w:eastAsia="Times New Roman" w:hAnsi="Times New Roman"/>
-                <w:sz w:val="15"/>
-                <w:szCs w:val="15"/>
-              </w:rPr>
-              <w:t xml:space="preserve">Paper parity</w:t>
-            </w:r>
-          </w:p>
-        </w:tc>
-        <w:tc>
-          <w:tcPr>
-            <w:tcW w:type="dxa" w:w="2850"/>
-            <w:tcBorders>
-              <w:top w:val="none" w:color="FFFFFF" w:sz="0"/>
-              <w:left w:val="none" w:color="FFFFFF" w:sz="0"/>
-              <w:bottom w:val="single" w:color="000000" w:sz="8"/>
-              <w:right w:val="none" w:color="FFFFFF" w:sz="0"/>
-            </w:tcBorders>
-            <w:tcMar>
-              <w:top w:type="dxa" w:w="30"/>
-              <w:left w:type="dxa" w:w="70"/>
-              <w:bottom w:type="dxa" w:w="30"/>
-              <w:right w:type="dxa" w:w="70"/>
-            </w:tcMar>
-            <w:vAlign w:val="top"/>
-          </w:tcPr>
-          <w:p>
-            <w:pPr>
-              <w:spacing w:after="0"/>
-            </w:pPr>
-            <w:r>
-              <w:rPr>
-                <w:rFonts w:ascii="Times New Roman" w:cs="Times New Roman" w:eastAsia="Times New Roman" w:hAnsi="Times New Roman"/>
-                <w:sz w:val="15"/>
-                <w:szCs w:val="15"/>
-              </w:rPr>
-              <w:t xml:space="preserve">Every quoted number is regenerated from a committed result file, and none is typed by hand</w:t>
-            </w:r>
-          </w:p>
-        </w:tc>
-        <w:tc>
-          <w:tcPr>
-            <w:tcW w:type="dxa" w:w="850"/>
-            <w:tcBorders>
-              <w:top w:val="none" w:color="FFFFFF" w:sz="0"/>
-              <w:left w:val="none" w:color="FFFFFF" w:sz="0"/>
-              <w:bottom w:val="single" w:color="000000" w:sz="8"/>
-              <w:right w:val="none" w:color="FFFFFF" w:sz="0"/>
-            </w:tcBorders>
-            <w:tcMar>
-              <w:top w:type="dxa" w:w="30"/>
-              <w:left w:type="dxa" w:w="70"/>
-              <w:bottom w:type="dxa" w:w="30"/>
-              <w:right w:type="dxa" w:w="70"/>
-            </w:tcMar>
-            <w:vAlign w:val="top"/>
-          </w:tcPr>
-          <w:p>
-            <w:pPr>
-              <w:spacing w:after="0"/>
-            </w:pPr>
-            <w:r>
-              <w:rPr>
-                <w:rFonts w:ascii="Times New Roman" w:cs="Times New Roman" w:eastAsia="Times New Roman" w:hAnsi="Times New Roman"/>
-                <w:sz w:val="15"/>
-                <w:szCs w:val="15"/>
-              </w:rPr>
-              <w:t xml:space="preserve">–</w:t>
-            </w:r>
-          </w:p>
-        </w:tc>
-      </w:tr>
-    </w:tbl>
-    <w:p>
-      <w:pPr>
-        <w:spacing w:after="60"/>
-      </w:pPr>
+        <w:t xml:space="preserve">A value that is wrong for its context but internally consistent can produce a wrong result without raising any error, so the checks in Table II (Appendix E) run before any result is accepted. Routing decisions are compared exactly, and floating-point values within tolerances derived from their arithmetic.</w:t>
+      </w:r>
     </w:p>
     <w:p>
       <w:pPr>
@@ -3148,6 +2468,7 @@
           </w:tcPr>
           <w:p>
             <w:pPr>
+              <w:keepNext/>
               <w:spacing w:after="0"/>
             </w:pPr>
             <w:r>
@@ -3181,6 +2502,7 @@
           </w:tcPr>
           <w:p>
             <w:pPr>
+              <w:keepNext/>
               <w:spacing w:after="0"/>
             </w:pPr>
             <w:r>
@@ -3214,6 +2536,7 @@
           </w:tcPr>
           <w:p>
             <w:pPr>
+              <w:keepNext/>
               <w:spacing w:after="0"/>
             </w:pPr>
             <w:r>
@@ -3247,6 +2570,7 @@
           </w:tcPr>
           <w:p>
             <w:pPr>
+              <w:keepNext/>
               <w:spacing w:after="0"/>
             </w:pPr>
             <w:r>
@@ -3285,6 +2609,7 @@
           </w:tcPr>
           <w:p>
             <w:pPr>
+              <w:keepNext/>
               <w:spacing w:after="0"/>
             </w:pPr>
             <w:r>
@@ -3316,6 +2641,7 @@
           </w:tcPr>
           <w:p>
             <w:pPr>
+              <w:keepNext/>
               <w:spacing w:after="0"/>
             </w:pPr>
             <w:r>
@@ -3347,6 +2673,7 @@
           </w:tcPr>
           <w:p>
             <w:pPr>
+              <w:keepNext/>
               <w:spacing w:after="0"/>
             </w:pPr>
             <w:r>
@@ -3378,6 +2705,7 @@
           </w:tcPr>
           <w:p>
             <w:pPr>
+              <w:keepNext/>
               <w:spacing w:after="0"/>
             </w:pPr>
             <w:r>
@@ -3414,6 +2742,7 @@
           </w:tcPr>
           <w:p>
             <w:pPr>
+              <w:keepNext/>
               <w:spacing w:after="0"/>
             </w:pPr>
             <w:r>
@@ -3445,6 +2774,7 @@
           </w:tcPr>
           <w:p>
             <w:pPr>
+              <w:keepNext/>
               <w:spacing w:after="0"/>
             </w:pPr>
             <w:r>
@@ -3476,6 +2806,7 @@
           </w:tcPr>
           <w:p>
             <w:pPr>
+              <w:keepNext/>
               <w:spacing w:after="0"/>
             </w:pPr>
             <w:r>
@@ -3507,6 +2838,7 @@
           </w:tcPr>
           <w:p>
             <w:pPr>
+              <w:keepNext/>
               <w:spacing w:after="0"/>
             </w:pPr>
             <w:r>
@@ -3543,6 +2875,7 @@
           </w:tcPr>
           <w:p>
             <w:pPr>
+              <w:keepNext/>
               <w:spacing w:after="0"/>
             </w:pPr>
             <w:r>
@@ -3574,6 +2907,7 @@
           </w:tcPr>
           <w:p>
             <w:pPr>
+              <w:keepNext/>
               <w:spacing w:after="0"/>
             </w:pPr>
             <w:r>
@@ -3605,6 +2939,7 @@
           </w:tcPr>
           <w:p>
             <w:pPr>
+              <w:keepNext/>
               <w:spacing w:after="0"/>
             </w:pPr>
             <w:r>
@@ -3636,6 +2971,7 @@
           </w:tcPr>
           <w:p>
             <w:pPr>
+              <w:keepNext/>
               <w:spacing w:after="0"/>
             </w:pPr>
             <w:r>
@@ -3672,6 +3008,7 @@
           </w:tcPr>
           <w:p>
             <w:pPr>
+              <w:keepNext/>
               <w:spacing w:after="0"/>
             </w:pPr>
             <w:r>
@@ -3703,6 +3040,7 @@
           </w:tcPr>
           <w:p>
             <w:pPr>
+              <w:keepNext/>
               <w:spacing w:after="0"/>
             </w:pPr>
             <w:r>
@@ -3734,6 +3072,7 @@
           </w:tcPr>
           <w:p>
             <w:pPr>
+              <w:keepNext/>
               <w:spacing w:after="0"/>
             </w:pPr>
             <w:r>
@@ -3765,6 +3104,7 @@
           </w:tcPr>
           <w:p>
             <w:pPr>
+              <w:keepNext/>
               <w:spacing w:after="0"/>
             </w:pPr>
             <w:r>
@@ -3801,6 +3141,7 @@
           </w:tcPr>
           <w:p>
             <w:pPr>
+              <w:keepNext/>
               <w:spacing w:after="0"/>
             </w:pPr>
             <w:r>
@@ -3832,6 +3173,7 @@
           </w:tcPr>
           <w:p>
             <w:pPr>
+              <w:keepNext/>
               <w:spacing w:after="0"/>
             </w:pPr>
             <w:r>
@@ -3863,6 +3205,7 @@
           </w:tcPr>
           <w:p>
             <w:pPr>
+              <w:keepNext/>
               <w:spacing w:after="0"/>
             </w:pPr>
             <w:r>
@@ -3894,6 +3237,7 @@
           </w:tcPr>
           <w:p>
             <w:pPr>
+              <w:keepNext/>
               <w:spacing w:after="0"/>
             </w:pPr>
             <w:r>
@@ -3930,6 +3274,7 @@
           </w:tcPr>
           <w:p>
             <w:pPr>
+              <w:keepNext/>
               <w:spacing w:after="0"/>
             </w:pPr>
             <w:r>
@@ -3961,6 +3306,7 @@
           </w:tcPr>
           <w:p>
             <w:pPr>
+              <w:keepNext/>
               <w:spacing w:after="0"/>
             </w:pPr>
             <w:r>
@@ -3992,6 +3338,7 @@
           </w:tcPr>
           <w:p>
             <w:pPr>
+              <w:keepNext/>
               <w:spacing w:after="0"/>
             </w:pPr>
             <w:r>
@@ -4023,6 +3370,7 @@
           </w:tcPr>
           <w:p>
             <w:pPr>
+              <w:keepNext/>
               <w:spacing w:after="0"/>
             </w:pPr>
             <w:r>
@@ -4059,6 +3407,7 @@
           </w:tcPr>
           <w:p>
             <w:pPr>
+              <w:keepNext/>
               <w:spacing w:after="0"/>
             </w:pPr>
             <w:r>
@@ -4090,6 +3439,7 @@
           </w:tcPr>
           <w:p>
             <w:pPr>
+              <w:keepNext/>
               <w:spacing w:after="0"/>
             </w:pPr>
             <w:r>
@@ -4121,6 +3471,7 @@
           </w:tcPr>
           <w:p>
             <w:pPr>
+              <w:keepNext/>
               <w:spacing w:after="0"/>
             </w:pPr>
             <w:r>
@@ -4152,6 +3503,7 @@
           </w:tcPr>
           <w:p>
             <w:pPr>
+              <w:keepNext/>
               <w:spacing w:after="0"/>
             </w:pPr>
             <w:r>
@@ -4188,6 +3540,7 @@
           </w:tcPr>
           <w:p>
             <w:pPr>
+              <w:keepNext/>
               <w:spacing w:after="0"/>
             </w:pPr>
             <w:r>
@@ -4219,6 +3572,7 @@
           </w:tcPr>
           <w:p>
             <w:pPr>
+              <w:keepNext/>
               <w:spacing w:after="0"/>
             </w:pPr>
             <w:r>
@@ -4250,6 +3604,7 @@
           </w:tcPr>
           <w:p>
             <w:pPr>
+              <w:keepNext/>
               <w:spacing w:after="0"/>
             </w:pPr>
             <w:r>
@@ -4281,6 +3636,7 @@
           </w:tcPr>
           <w:p>
             <w:pPr>
+              <w:keepNext/>
               <w:spacing w:after="0"/>
             </w:pPr>
             <w:r>
@@ -4317,6 +3673,7 @@
           </w:tcPr>
           <w:p>
             <w:pPr>
+              <w:keepNext/>
               <w:spacing w:after="0"/>
             </w:pPr>
             <w:r>
@@ -4348,6 +3705,7 @@
           </w:tcPr>
           <w:p>
             <w:pPr>
+              <w:keepNext/>
               <w:spacing w:after="0"/>
             </w:pPr>
             <w:r>
@@ -4379,6 +3737,7 @@
           </w:tcPr>
           <w:p>
             <w:pPr>
+              <w:keepNext/>
               <w:spacing w:after="0"/>
             </w:pPr>
             <w:r>
@@ -4410,6 +3769,7 @@
           </w:tcPr>
           <w:p>
             <w:pPr>
+              <w:keepNext/>
               <w:spacing w:after="0"/>
             </w:pPr>
             <w:r>
@@ -4586,918 +3946,8 @@
           <w:sz w:val="20"/>
           <w:szCs w:val="20"/>
         </w:rPr>
-        <w:t xml:space="preserve">Table IV gives the configuration of every component. Latency is the warm median per ticket at batch size one.</w:t>
-      </w:r>
-    </w:p>
-    <w:p>
-      <w:pPr>
-        <w:keepNext/>
-        <w:spacing w:after="0" w:before="160"/>
-        <w:jc w:val="center"/>
-      </w:pPr>
-      <w:r>
-        <w:rPr>
-          <w:rFonts w:ascii="Times New Roman" w:cs="Times New Roman" w:eastAsia="Times New Roman" w:hAnsi="Times New Roman"/>
-          <w:sz w:val="16"/>
-          <w:szCs w:val="16"/>
-        </w:rPr>
-        <w:t xml:space="preserve">TABLE IV</w:t>
-      </w:r>
-    </w:p>
-    <w:p>
-      <w:pPr>
-        <w:keepNext/>
-        <w:spacing w:after="80"/>
-        <w:jc w:val="center"/>
-      </w:pPr>
-      <w:r>
-        <w:rPr>
-          <w:rFonts w:ascii="Times New Roman" w:cs="Times New Roman" w:eastAsia="Times New Roman" w:hAnsi="Times New Roman"/>
-          <w:smallCaps/>
-          <w:sz w:val="16"/>
-          <w:szCs w:val="16"/>
-        </w:rPr>
-        <w:t xml:space="preserve">Model configurations and hyperparameters</w:t>
-      </w:r>
-    </w:p>
-    <w:tbl>
-      <w:tblPr>
-        <w:tblW w:type="dxa" w:w="4850"/>
-        <w:jc w:val="center"/>
-        <w:tblBorders>
-          <w:top w:val="none" w:color="FFFFFF" w:sz="0"/>
-          <w:left w:val="none" w:color="FFFFFF" w:sz="0"/>
-          <w:bottom w:val="none" w:color="FFFFFF" w:sz="0"/>
-          <w:right w:val="none" w:color="FFFFFF" w:sz="0"/>
-          <w:insideH w:val="none" w:color="FFFFFF" w:sz="0"/>
-          <w:insideV w:val="none" w:color="FFFFFF" w:sz="0"/>
-        </w:tblBorders>
-      </w:tblPr>
-      <w:tblGrid>
-        <w:gridCol w:w="1450"/>
-        <w:gridCol w:w="3400"/>
-      </w:tblGrid>
-      <w:tr>
-        <w:trPr>
-          <w:tblHeader/>
-        </w:trPr>
-        <w:tc>
-          <w:tcPr>
-            <w:tcW w:type="dxa" w:w="1450"/>
-            <w:tcBorders>
-              <w:top w:val="single" w:color="000000" w:sz="8"/>
-              <w:left w:val="none" w:color="FFFFFF" w:sz="0"/>
-              <w:bottom w:val="single" w:color="000000" w:sz="4"/>
-              <w:right w:val="none" w:color="FFFFFF" w:sz="0"/>
-            </w:tcBorders>
-            <w:tcMar>
-              <w:top w:type="dxa" w:w="30"/>
-              <w:left w:type="dxa" w:w="70"/>
-              <w:bottom w:type="dxa" w:w="30"/>
-              <w:right w:type="dxa" w:w="70"/>
-            </w:tcMar>
-            <w:vAlign w:val="top"/>
-          </w:tcPr>
-          <w:p>
-            <w:pPr>
-              <w:spacing w:after="0"/>
-            </w:pPr>
-            <w:r>
-              <w:rPr>
-                <w:rFonts w:ascii="Times New Roman" w:cs="Times New Roman" w:eastAsia="Times New Roman" w:hAnsi="Times New Roman"/>
-                <w:b/>
-                <w:bCs/>
-                <w:sz w:val="15"/>
-                <w:szCs w:val="15"/>
-              </w:rPr>
-              <w:t xml:space="preserve">Component</w:t>
-            </w:r>
-          </w:p>
-        </w:tc>
-        <w:tc>
-          <w:tcPr>
-            <w:tcW w:type="dxa" w:w="3400"/>
-            <w:tcBorders>
-              <w:top w:val="single" w:color="000000" w:sz="8"/>
-              <w:left w:val="none" w:color="FFFFFF" w:sz="0"/>
-              <w:bottom w:val="single" w:color="000000" w:sz="4"/>
-              <w:right w:val="none" w:color="FFFFFF" w:sz="0"/>
-            </w:tcBorders>
-            <w:tcMar>
-              <w:top w:type="dxa" w:w="30"/>
-              <w:left w:type="dxa" w:w="70"/>
-              <w:bottom w:type="dxa" w:w="30"/>
-              <w:right w:type="dxa" w:w="70"/>
-            </w:tcMar>
-            <w:vAlign w:val="top"/>
-          </w:tcPr>
-          <w:p>
-            <w:pPr>
-              <w:spacing w:after="0"/>
-            </w:pPr>
-            <w:r>
-              <w:rPr>
-                <w:rFonts w:ascii="Times New Roman" w:cs="Times New Roman" w:eastAsia="Times New Roman" w:hAnsi="Times New Roman"/>
-                <w:b/>
-                <w:bCs/>
-                <w:sz w:val="15"/>
-                <w:szCs w:val="15"/>
-              </w:rPr>
-              <w:t xml:space="preserve">Configuration</w:t>
-            </w:r>
-          </w:p>
-        </w:tc>
-      </w:tr>
-      <w:tr>
-        <w:trPr>
-          <w:tblHeader w:val="false"/>
-        </w:trPr>
-        <w:tc>
-          <w:tcPr>
-            <w:tcW w:type="dxa" w:w="1450"/>
-            <w:tcBorders>
-              <w:top w:val="none" w:color="FFFFFF" w:sz="0"/>
-              <w:left w:val="none" w:color="FFFFFF" w:sz="0"/>
-              <w:bottom w:val="none" w:color="FFFFFF" w:sz="0"/>
-              <w:right w:val="none" w:color="FFFFFF" w:sz="0"/>
-            </w:tcBorders>
-            <w:tcMar>
-              <w:top w:type="dxa" w:w="30"/>
-              <w:left w:type="dxa" w:w="70"/>
-              <w:bottom w:type="dxa" w:w="30"/>
-              <w:right w:type="dxa" w:w="70"/>
-            </w:tcMar>
-            <w:vAlign w:val="top"/>
-          </w:tcPr>
-          <w:p>
-            <w:pPr>
-              <w:spacing w:after="0"/>
-            </w:pPr>
-            <w:r>
-              <w:rPr>
-                <w:rFonts w:ascii="Times New Roman" w:cs="Times New Roman" w:eastAsia="Times New Roman" w:hAnsi="Times New Roman"/>
-                <w:sz w:val="15"/>
-                <w:szCs w:val="15"/>
-              </w:rPr>
-              <w:t xml:space="preserve">Tier 1</w:t>
-            </w:r>
-          </w:p>
-        </w:tc>
-        <w:tc>
-          <w:tcPr>
-            <w:tcW w:type="dxa" w:w="3400"/>
-            <w:tcBorders>
-              <w:top w:val="none" w:color="FFFFFF" w:sz="0"/>
-              <w:left w:val="none" w:color="FFFFFF" w:sz="0"/>
-              <w:bottom w:val="none" w:color="FFFFFF" w:sz="0"/>
-              <w:right w:val="none" w:color="FFFFFF" w:sz="0"/>
-            </w:tcBorders>
-            <w:tcMar>
-              <w:top w:type="dxa" w:w="30"/>
-              <w:left w:type="dxa" w:w="70"/>
-              <w:bottom w:type="dxa" w:w="30"/>
-              <w:right w:type="dxa" w:w="70"/>
-            </w:tcMar>
-            <w:vAlign w:val="top"/>
-          </w:tcPr>
-          <w:p>
-            <w:pPr>
-              <w:spacing w:after="0"/>
-            </w:pPr>
-            <w:r>
-              <w:rPr>
-                <w:rFonts w:ascii="Times New Roman" w:cs="Times New Roman" w:eastAsia="Times New Roman" w:hAnsi="Times New Roman"/>
-                <w:sz w:val="15"/>
-                <w:szCs w:val="15"/>
-              </w:rPr>
-              <w:t xml:space="preserve">TF-IDF, committed vocabulary of 5,000 features, </w:t>
-            </w:r>
-            <w:r>
-              <w:rPr>
-                <w:rFonts w:ascii="Times New Roman" w:cs="Times New Roman" w:eastAsia="Times New Roman" w:hAnsi="Times New Roman"/>
-                <w:sz w:val="15"/>
-                <w:szCs w:val="15"/>
-              </w:rPr>
-              <w:t xml:space="preserve">unigrams and bigrams, English stop words removed</w:t>
-            </w:r>
-            <w:r>
-              <w:rPr>
-                <w:rFonts w:ascii="Times New Roman" w:cs="Times New Roman" w:eastAsia="Times New Roman" w:hAnsi="Times New Roman"/>
-                <w:sz w:val="15"/>
-                <w:szCs w:val="15"/>
-              </w:rPr>
-              <w:t xml:space="preserve">; logistic regression, </w:t>
-            </w:r>
-            <w:r>
-              <w:rPr>
-                <w:rFonts w:ascii="Times New Roman" w:cs="Times New Roman" w:eastAsia="Times New Roman" w:hAnsi="Times New Roman"/>
-                <w:sz w:val="15"/>
-                <w:szCs w:val="15"/>
-              </w:rPr>
-              <w:t xml:space="preserve">max_iter = 1000; otherwise scikit-learn defaults (L2, C = 1.0, lbfgs)</w:t>
-            </w:r>
-          </w:p>
-        </w:tc>
-      </w:tr>
-      <w:tr>
-        <w:trPr>
-          <w:tblHeader w:val="false"/>
-        </w:trPr>
-        <w:tc>
-          <w:tcPr>
-            <w:tcW w:type="dxa" w:w="1450"/>
-            <w:tcBorders>
-              <w:top w:val="none" w:color="FFFFFF" w:sz="0"/>
-              <w:left w:val="none" w:color="FFFFFF" w:sz="0"/>
-              <w:bottom w:val="none" w:color="FFFFFF" w:sz="0"/>
-              <w:right w:val="none" w:color="FFFFFF" w:sz="0"/>
-            </w:tcBorders>
-            <w:tcMar>
-              <w:top w:type="dxa" w:w="30"/>
-              <w:left w:type="dxa" w:w="70"/>
-              <w:bottom w:type="dxa" w:w="30"/>
-              <w:right w:type="dxa" w:w="70"/>
-            </w:tcMar>
-            <w:vAlign w:val="top"/>
-          </w:tcPr>
-          <w:p>
-            <w:pPr>
-              <w:spacing w:after="0"/>
-            </w:pPr>
-            <w:r>
-              <w:rPr>
-                <w:rFonts w:ascii="Times New Roman" w:cs="Times New Roman" w:eastAsia="Times New Roman" w:hAnsi="Times New Roman"/>
-                <w:sz w:val="15"/>
-                <w:szCs w:val="15"/>
-              </w:rPr>
-              <w:t xml:space="preserve">Tier 2</w:t>
-            </w:r>
-          </w:p>
-        </w:tc>
-        <w:tc>
-          <w:tcPr>
-            <w:tcW w:type="dxa" w:w="3400"/>
-            <w:tcBorders>
-              <w:top w:val="none" w:color="FFFFFF" w:sz="0"/>
-              <w:left w:val="none" w:color="FFFFFF" w:sz="0"/>
-              <w:bottom w:val="none" w:color="FFFFFF" w:sz="0"/>
-              <w:right w:val="none" w:color="FFFFFF" w:sz="0"/>
-            </w:tcBorders>
-            <w:tcMar>
-              <w:top w:type="dxa" w:w="30"/>
-              <w:left w:type="dxa" w:w="70"/>
-              <w:bottom w:type="dxa" w:w="30"/>
-              <w:right w:type="dxa" w:w="70"/>
-            </w:tcMar>
-            <w:vAlign w:val="top"/>
-          </w:tcPr>
-          <w:p>
-            <w:pPr>
-              <w:spacing w:after="0"/>
-            </w:pPr>
-            <w:r>
-              <w:rPr>
-                <w:rFonts w:ascii="Times New Roman" w:cs="Times New Roman" w:eastAsia="Times New Roman" w:hAnsi="Times New Roman"/>
-                <w:sz w:val="15"/>
-                <w:szCs w:val="15"/>
-              </w:rPr>
-              <w:t xml:space="preserve">bge-base-en-v1.5 (768-d, frozen) + logistic regression, </w:t>
-            </w:r>
-            <w:r>
-              <w:rPr>
-                <w:rFonts w:ascii="Times New Roman" w:cs="Times New Roman" w:eastAsia="Times New Roman" w:hAnsi="Times New Roman"/>
-                <w:sz w:val="15"/>
-                <w:szCs w:val="15"/>
-              </w:rPr>
-              <w:t xml:space="preserve">max_iter = 1000, scikit-learn defaults, fitted on the 3,200-row split</w:t>
-            </w:r>
-          </w:p>
-        </w:tc>
-      </w:tr>
-      <w:tr>
-        <w:trPr>
-          <w:tblHeader w:val="false"/>
-        </w:trPr>
-        <w:tc>
-          <w:tcPr>
-            <w:tcW w:type="dxa" w:w="1450"/>
-            <w:tcBorders>
-              <w:top w:val="none" w:color="FFFFFF" w:sz="0"/>
-              <w:left w:val="none" w:color="FFFFFF" w:sz="0"/>
-              <w:bottom w:val="none" w:color="FFFFFF" w:sz="0"/>
-              <w:right w:val="none" w:color="FFFFFF" w:sz="0"/>
-            </w:tcBorders>
-            <w:tcMar>
-              <w:top w:type="dxa" w:w="30"/>
-              <w:left w:type="dxa" w:w="70"/>
-              <w:bottom w:type="dxa" w:w="30"/>
-              <w:right w:type="dxa" w:w="70"/>
-            </w:tcMar>
-            <w:vAlign w:val="top"/>
-          </w:tcPr>
-          <w:p>
-            <w:pPr>
-              <w:spacing w:after="0"/>
-            </w:pPr>
-            <w:r>
-              <w:rPr>
-                <w:rFonts w:ascii="Times New Roman" w:cs="Times New Roman" w:eastAsia="Times New Roman" w:hAnsi="Times New Roman"/>
-                <w:sz w:val="15"/>
-                <w:szCs w:val="15"/>
-              </w:rPr>
-              <w:t xml:space="preserve">Cascade gate</w:t>
-            </w:r>
-          </w:p>
-        </w:tc>
-        <w:tc>
-          <w:tcPr>
-            <w:tcW w:type="dxa" w:w="3400"/>
-            <w:tcBorders>
-              <w:top w:val="none" w:color="FFFFFF" w:sz="0"/>
-              <w:left w:val="none" w:color="FFFFFF" w:sz="0"/>
-              <w:bottom w:val="none" w:color="FFFFFF" w:sz="0"/>
-              <w:right w:val="none" w:color="FFFFFF" w:sz="0"/>
-            </w:tcBorders>
-            <w:tcMar>
-              <w:top w:type="dxa" w:w="30"/>
-              <w:left w:type="dxa" w:w="70"/>
-              <w:bottom w:type="dxa" w:w="30"/>
-              <w:right w:type="dxa" w:w="70"/>
-            </w:tcMar>
-            <w:vAlign w:val="top"/>
-          </w:tcPr>
-          <w:p>
-            <w:pPr>
-              <w:spacing w:after="0"/>
-            </w:pPr>
-            <w:r>
-              <w:rPr>
-                <w:rFonts w:ascii="Times New Roman" w:cs="Times New Roman" w:eastAsia="Times New Roman" w:hAnsi="Times New Roman"/>
-                <w:sz w:val="15"/>
-                <w:szCs w:val="15"/>
-              </w:rPr>
-              <w:t xml:space="preserve">Accept Tier-1 label if top-class probability ≥ 0.50</w:t>
-            </w:r>
-          </w:p>
-        </w:tc>
-      </w:tr>
-      <w:tr>
-        <w:trPr>
-          <w:tblHeader w:val="false"/>
-        </w:trPr>
-        <w:tc>
-          <w:tcPr>
-            <w:tcW w:type="dxa" w:w="1450"/>
-            <w:tcBorders>
-              <w:top w:val="none" w:color="FFFFFF" w:sz="0"/>
-              <w:left w:val="none" w:color="FFFFFF" w:sz="0"/>
-              <w:bottom w:val="none" w:color="FFFFFF" w:sz="0"/>
-              <w:right w:val="none" w:color="FFFFFF" w:sz="0"/>
-            </w:tcBorders>
-            <w:tcMar>
-              <w:top w:type="dxa" w:w="30"/>
-              <w:left w:type="dxa" w:w="70"/>
-              <w:bottom w:type="dxa" w:w="30"/>
-              <w:right w:type="dxa" w:w="70"/>
-            </w:tcMar>
-            <w:vAlign w:val="top"/>
-          </w:tcPr>
-          <w:p>
-            <w:pPr>
-              <w:spacing w:after="0"/>
-            </w:pPr>
-            <w:r>
-              <w:rPr>
-                <w:rFonts w:ascii="Times New Roman" w:cs="Times New Roman" w:eastAsia="Times New Roman" w:hAnsi="Times New Roman"/>
-                <w:sz w:val="15"/>
-                <w:szCs w:val="15"/>
-              </w:rPr>
-              <w:t xml:space="preserve">Retrieval</w:t>
-            </w:r>
-          </w:p>
-        </w:tc>
-        <w:tc>
-          <w:tcPr>
-            <w:tcW w:type="dxa" w:w="3400"/>
-            <w:tcBorders>
-              <w:top w:val="none" w:color="FFFFFF" w:sz="0"/>
-              <w:left w:val="none" w:color="FFFFFF" w:sz="0"/>
-              <w:bottom w:val="none" w:color="FFFFFF" w:sz="0"/>
-              <w:right w:val="none" w:color="FFFFFF" w:sz="0"/>
-            </w:tcBorders>
-            <w:tcMar>
-              <w:top w:type="dxa" w:w="30"/>
-              <w:left w:type="dxa" w:w="70"/>
-              <w:bottom w:type="dxa" w:w="30"/>
-              <w:right w:type="dxa" w:w="70"/>
-            </w:tcMar>
-            <w:vAlign w:val="top"/>
-          </w:tcPr>
-          <w:p>
-            <w:pPr>
-              <w:spacing w:after="0"/>
-            </w:pPr>
-            <w:r>
-              <w:rPr>
-                <w:rFonts w:ascii="Times New Roman" w:cs="Times New Roman" w:eastAsia="Times New Roman" w:hAnsi="Times New Roman"/>
-                <w:sz w:val="15"/>
-                <w:szCs w:val="15"/>
-              </w:rPr>
-              <w:t xml:space="preserve">FAISS inner-product index over normalised BGE embeddings; top-5 neighbours</w:t>
-            </w:r>
-          </w:p>
-        </w:tc>
-      </w:tr>
-      <w:tr>
-        <w:trPr>
-          <w:tblHeader w:val="false"/>
-        </w:trPr>
-        <w:tc>
-          <w:tcPr>
-            <w:tcW w:type="dxa" w:w="1450"/>
-            <w:tcBorders>
-              <w:top w:val="none" w:color="FFFFFF" w:sz="0"/>
-              <w:left w:val="none" w:color="FFFFFF" w:sz="0"/>
-              <w:bottom w:val="none" w:color="FFFFFF" w:sz="0"/>
-              <w:right w:val="none" w:color="FFFFFF" w:sz="0"/>
-            </w:tcBorders>
-            <w:tcMar>
-              <w:top w:type="dxa" w:w="30"/>
-              <w:left w:type="dxa" w:w="70"/>
-              <w:bottom w:type="dxa" w:w="30"/>
-              <w:right w:type="dxa" w:w="70"/>
-            </w:tcMar>
-            <w:vAlign w:val="top"/>
-          </w:tcPr>
-          <w:p>
-            <w:pPr>
-              <w:spacing w:after="0"/>
-            </w:pPr>
-            <w:r>
-              <w:rPr>
-                <w:rFonts w:ascii="Times New Roman" w:cs="Times New Roman" w:eastAsia="Times New Roman" w:hAnsi="Times New Roman"/>
-                <w:sz w:val="15"/>
-                <w:szCs w:val="15"/>
-              </w:rPr>
-              <w:t xml:space="preserve">Retrieval gate</w:t>
-            </w:r>
-          </w:p>
-        </w:tc>
-        <w:tc>
-          <w:tcPr>
-            <w:tcW w:type="dxa" w:w="3400"/>
-            <w:tcBorders>
-              <w:top w:val="none" w:color="FFFFFF" w:sz="0"/>
-              <w:left w:val="none" w:color="FFFFFF" w:sz="0"/>
-              <w:bottom w:val="none" w:color="FFFFFF" w:sz="0"/>
-              <w:right w:val="none" w:color="FFFFFF" w:sz="0"/>
-            </w:tcBorders>
-            <w:tcMar>
-              <w:top w:type="dxa" w:w="30"/>
-              <w:left w:type="dxa" w:w="70"/>
-              <w:bottom w:type="dxa" w:w="30"/>
-              <w:right w:type="dxa" w:w="70"/>
-            </w:tcMar>
-            <w:vAlign w:val="top"/>
-          </w:tcPr>
-          <w:p>
-            <w:pPr>
-              <w:spacing w:after="0"/>
-            </w:pPr>
-            <w:r>
-              <w:rPr>
-                <w:rFonts w:ascii="Times New Roman" w:cs="Times New Roman" w:eastAsia="Times New Roman" w:hAnsi="Times New Roman"/>
-                <w:sz w:val="15"/>
-                <w:szCs w:val="15"/>
-              </w:rPr>
-              <w:t xml:space="preserve">Draft only if top-1 cosine similarity ≥ 0.67</w:t>
-            </w:r>
-          </w:p>
-        </w:tc>
-      </w:tr>
-      <w:tr>
-        <w:trPr>
-          <w:tblHeader w:val="false"/>
-        </w:trPr>
-        <w:tc>
-          <w:tcPr>
-            <w:tcW w:type="dxa" w:w="1450"/>
-            <w:tcBorders>
-              <w:top w:val="none" w:color="FFFFFF" w:sz="0"/>
-              <w:left w:val="none" w:color="FFFFFF" w:sz="0"/>
-              <w:bottom w:val="none" w:color="FFFFFF" w:sz="0"/>
-              <w:right w:val="none" w:color="FFFFFF" w:sz="0"/>
-            </w:tcBorders>
-            <w:tcMar>
-              <w:top w:type="dxa" w:w="30"/>
-              <w:left w:type="dxa" w:w="70"/>
-              <w:bottom w:type="dxa" w:w="30"/>
-              <w:right w:type="dxa" w:w="70"/>
-            </w:tcMar>
-            <w:vAlign w:val="top"/>
-          </w:tcPr>
-          <w:p>
-            <w:pPr>
-              <w:spacing w:after="0"/>
-            </w:pPr>
-            <w:r>
-              <w:rPr>
-                <w:rFonts w:ascii="Times New Roman" w:cs="Times New Roman" w:eastAsia="Times New Roman" w:hAnsi="Times New Roman"/>
-                <w:sz w:val="15"/>
-                <w:szCs w:val="15"/>
-              </w:rPr>
-              <w:t xml:space="preserve">Drafting LLM</w:t>
-            </w:r>
-          </w:p>
-        </w:tc>
-        <w:tc>
-          <w:tcPr>
-            <w:tcW w:type="dxa" w:w="3400"/>
-            <w:tcBorders>
-              <w:top w:val="none" w:color="FFFFFF" w:sz="0"/>
-              <w:left w:val="none" w:color="FFFFFF" w:sz="0"/>
-              <w:bottom w:val="none" w:color="FFFFFF" w:sz="0"/>
-              <w:right w:val="none" w:color="FFFFFF" w:sz="0"/>
-            </w:tcBorders>
-            <w:tcMar>
-              <w:top w:type="dxa" w:w="30"/>
-              <w:left w:type="dxa" w:w="70"/>
-              <w:bottom w:type="dxa" w:w="30"/>
-              <w:right w:type="dxa" w:w="70"/>
-            </w:tcMar>
-            <w:vAlign w:val="top"/>
-          </w:tcPr>
-          <w:p>
-            <w:pPr>
-              <w:spacing w:after="0"/>
-            </w:pPr>
-            <w:r>
-              <w:rPr>
-                <w:rFonts w:ascii="Times New Roman" w:cs="Times New Roman" w:eastAsia="Times New Roman" w:hAnsi="Times New Roman"/>
-                <w:sz w:val="15"/>
-                <w:szCs w:val="15"/>
-              </w:rPr>
-              <w:t xml:space="preserve">gemini-flash-lite, </w:t>
-            </w:r>
-            <w:r>
-              <w:rPr>
-                <w:rFonts w:ascii="Times New Roman" w:cs="Times New Roman" w:eastAsia="Times New Roman" w:hAnsi="Times New Roman"/>
-                <w:sz w:val="15"/>
-                <w:szCs w:val="15"/>
-              </w:rPr>
-              <w:t xml:space="preserve">API defaults (no generation config set); zero-shot runs at temperature 0.0</w:t>
-            </w:r>
-          </w:p>
-        </w:tc>
-      </w:tr>
-      <w:tr>
-        <w:trPr>
-          <w:tblHeader w:val="false"/>
-        </w:trPr>
-        <w:tc>
-          <w:tcPr>
-            <w:tcW w:type="dxa" w:w="1450"/>
-            <w:tcBorders>
-              <w:top w:val="none" w:color="FFFFFF" w:sz="0"/>
-              <w:left w:val="none" w:color="FFFFFF" w:sz="0"/>
-              <w:bottom w:val="none" w:color="FFFFFF" w:sz="0"/>
-              <w:right w:val="none" w:color="FFFFFF" w:sz="0"/>
-            </w:tcBorders>
-            <w:tcMar>
-              <w:top w:type="dxa" w:w="30"/>
-              <w:left w:type="dxa" w:w="70"/>
-              <w:bottom w:type="dxa" w:w="30"/>
-              <w:right w:type="dxa" w:w="70"/>
-            </w:tcMar>
-            <w:vAlign w:val="top"/>
-          </w:tcPr>
-          <w:p>
-            <w:pPr>
-              <w:spacing w:after="0"/>
-            </w:pPr>
-            <w:r>
-              <w:rPr>
-                <w:rFonts w:ascii="Times New Roman" w:cs="Times New Roman" w:eastAsia="Times New Roman" w:hAnsi="Times New Roman"/>
-                <w:sz w:val="15"/>
-                <w:szCs w:val="15"/>
-              </w:rPr>
-              <w:t xml:space="preserve">Zero-shot baselines</w:t>
-            </w:r>
-          </w:p>
-        </w:tc>
-        <w:tc>
-          <w:tcPr>
-            <w:tcW w:type="dxa" w:w="3400"/>
-            <w:tcBorders>
-              <w:top w:val="none" w:color="FFFFFF" w:sz="0"/>
-              <w:left w:val="none" w:color="FFFFFF" w:sz="0"/>
-              <w:bottom w:val="none" w:color="FFFFFF" w:sz="0"/>
-              <w:right w:val="none" w:color="FFFFFF" w:sz="0"/>
-            </w:tcBorders>
-            <w:tcMar>
-              <w:top w:type="dxa" w:w="30"/>
-              <w:left w:type="dxa" w:w="70"/>
-              <w:bottom w:type="dxa" w:w="30"/>
-              <w:right w:type="dxa" w:w="70"/>
-            </w:tcMar>
-            <w:vAlign w:val="top"/>
-          </w:tcPr>
-          <w:p>
-            <w:pPr>
-              <w:spacing w:after="0"/>
-            </w:pPr>
-            <w:r>
-              <w:rPr>
-                <w:rFonts w:ascii="Times New Roman" w:cs="Times New Roman" w:eastAsia="Times New Roman" w:hAnsi="Times New Roman"/>
-                <w:sz w:val="15"/>
-                <w:szCs w:val="15"/>
-              </w:rPr>
-              <w:t xml:space="preserve">gemini-flash-lite and Qwen2.5-3B (local CPU) with byte-identical prompts</w:t>
-            </w:r>
-          </w:p>
-        </w:tc>
-      </w:tr>
-      <w:tr>
-        <w:trPr>
-          <w:tblHeader w:val="false"/>
-        </w:trPr>
-        <w:tc>
-          <w:tcPr>
-            <w:tcW w:type="dxa" w:w="1450"/>
-            <w:tcBorders>
-              <w:top w:val="none" w:color="FFFFFF" w:sz="0"/>
-              <w:left w:val="none" w:color="FFFFFF" w:sz="0"/>
-              <w:bottom w:val="none" w:color="FFFFFF" w:sz="0"/>
-              <w:right w:val="none" w:color="FFFFFF" w:sz="0"/>
-            </w:tcBorders>
-            <w:tcMar>
-              <w:top w:type="dxa" w:w="30"/>
-              <w:left w:type="dxa" w:w="70"/>
-              <w:bottom w:type="dxa" w:w="30"/>
-              <w:right w:type="dxa" w:w="70"/>
-            </w:tcMar>
-            <w:vAlign w:val="top"/>
-          </w:tcPr>
-          <w:p>
-            <w:pPr>
-              <w:spacing w:after="0"/>
-            </w:pPr>
-            <w:r>
-              <w:rPr>
-                <w:rFonts w:ascii="Times New Roman" w:cs="Times New Roman" w:eastAsia="Times New Roman" w:hAnsi="Times New Roman"/>
-                <w:sz w:val="15"/>
-                <w:szCs w:val="15"/>
-              </w:rPr>
-              <w:t xml:space="preserve">Other encoders</w:t>
-            </w:r>
-          </w:p>
-        </w:tc>
-        <w:tc>
-          <w:tcPr>
-            <w:tcW w:type="dxa" w:w="3400"/>
-            <w:tcBorders>
-              <w:top w:val="none" w:color="FFFFFF" w:sz="0"/>
-              <w:left w:val="none" w:color="FFFFFF" w:sz="0"/>
-              <w:bottom w:val="none" w:color="FFFFFF" w:sz="0"/>
-              <w:right w:val="none" w:color="FFFFFF" w:sz="0"/>
-            </w:tcBorders>
-            <w:tcMar>
-              <w:top w:type="dxa" w:w="30"/>
-              <w:left w:type="dxa" w:w="70"/>
-              <w:bottom w:type="dxa" w:w="30"/>
-              <w:right w:type="dxa" w:w="70"/>
-            </w:tcMar>
-            <w:vAlign w:val="top"/>
-          </w:tcPr>
-          <w:p>
-            <w:pPr>
-              <w:spacing w:after="0"/>
-            </w:pPr>
-            <w:r>
-              <w:rPr>
-                <w:rFonts w:ascii="Times New Roman" w:cs="Times New Roman" w:eastAsia="Times New Roman" w:hAnsi="Times New Roman"/>
-                <w:sz w:val="15"/>
-                <w:szCs w:val="15"/>
-              </w:rPr>
-              <w:t xml:space="preserve">MiniLM and E5 with the same logistic head; DistilBERT fine-tuned, </w:t>
-            </w:r>
-            <w:r>
-              <w:rPr>
-                <w:rFonts w:ascii="Times New Roman" w:cs="Times New Roman" w:eastAsia="Times New Roman" w:hAnsi="Times New Roman"/>
-                <w:sz w:val="15"/>
-                <w:szCs w:val="15"/>
-              </w:rPr>
-              <w:t xml:space="preserve">4 epochs, learning rate 2 × 10⁻⁵, batch size 16, maximum length 128, weight decay 0.01</w:t>
-            </w:r>
-          </w:p>
-        </w:tc>
-      </w:tr>
-      <w:tr>
-        <w:trPr>
-          <w:tblHeader w:val="false"/>
-        </w:trPr>
-        <w:tc>
-          <w:tcPr>
-            <w:tcW w:type="dxa" w:w="1450"/>
-            <w:tcBorders>
-              <w:top w:val="none" w:color="FFFFFF" w:sz="0"/>
-              <w:left w:val="none" w:color="FFFFFF" w:sz="0"/>
-              <w:bottom w:val="none" w:color="FFFFFF" w:sz="0"/>
-              <w:right w:val="none" w:color="FFFFFF" w:sz="0"/>
-            </w:tcBorders>
-            <w:tcMar>
-              <w:top w:type="dxa" w:w="30"/>
-              <w:left w:type="dxa" w:w="70"/>
-              <w:bottom w:type="dxa" w:w="30"/>
-              <w:right w:type="dxa" w:w="70"/>
-            </w:tcMar>
-            <w:vAlign w:val="top"/>
-          </w:tcPr>
-          <w:p>
-            <w:pPr>
-              <w:spacing w:after="0"/>
-            </w:pPr>
-            <w:r>
-              <w:rPr>
-                <w:rFonts w:ascii="Times New Roman" w:cs="Times New Roman" w:eastAsia="Times New Roman" w:hAnsi="Times New Roman"/>
-                <w:sz w:val="15"/>
-                <w:szCs w:val="15"/>
-              </w:rPr>
-              <w:t xml:space="preserve">Clustering</w:t>
-            </w:r>
-          </w:p>
-        </w:tc>
-        <w:tc>
-          <w:tcPr>
-            <w:tcW w:type="dxa" w:w="3400"/>
-            <w:tcBorders>
-              <w:top w:val="none" w:color="FFFFFF" w:sz="0"/>
-              <w:left w:val="none" w:color="FFFFFF" w:sz="0"/>
-              <w:bottom w:val="none" w:color="FFFFFF" w:sz="0"/>
-              <w:right w:val="none" w:color="FFFFFF" w:sz="0"/>
-            </w:tcBorders>
-            <w:tcMar>
-              <w:top w:type="dxa" w:w="30"/>
-              <w:left w:type="dxa" w:w="70"/>
-              <w:bottom w:type="dxa" w:w="30"/>
-              <w:right w:type="dxa" w:w="70"/>
-            </w:tcMar>
-            <w:vAlign w:val="top"/>
-          </w:tcPr>
-          <w:p>
-            <w:pPr>
-              <w:spacing w:after="0"/>
-            </w:pPr>
-            <w:r>
-              <w:rPr>
-                <w:rFonts w:ascii="Times New Roman" w:cs="Times New Roman" w:eastAsia="Times New Roman" w:hAnsi="Times New Roman"/>
-                <w:sz w:val="15"/>
-                <w:szCs w:val="15"/>
-              </w:rPr>
-              <w:t xml:space="preserve">Resolution embeddings, similarity threshold 0.80, union-find grouping</w:t>
-            </w:r>
-          </w:p>
-        </w:tc>
-      </w:tr>
-      <w:tr>
-        <w:trPr>
-          <w:tblHeader w:val="false"/>
-        </w:trPr>
-        <w:tc>
-          <w:tcPr>
-            <w:tcW w:type="dxa" w:w="1450"/>
-            <w:tcBorders>
-              <w:top w:val="none" w:color="FFFFFF" w:sz="0"/>
-              <w:left w:val="none" w:color="FFFFFF" w:sz="0"/>
-              <w:bottom w:val="none" w:color="FFFFFF" w:sz="0"/>
-              <w:right w:val="none" w:color="FFFFFF" w:sz="0"/>
-            </w:tcBorders>
-            <w:tcMar>
-              <w:top w:type="dxa" w:w="30"/>
-              <w:left w:type="dxa" w:w="70"/>
-              <w:bottom w:type="dxa" w:w="30"/>
-              <w:right w:type="dxa" w:w="70"/>
-            </w:tcMar>
-            <w:vAlign w:val="top"/>
-          </w:tcPr>
-          <w:p>
-            <w:pPr>
-              <w:spacing w:after="0"/>
-            </w:pPr>
-            <w:r>
-              <w:rPr>
-                <w:rFonts w:ascii="Times New Roman" w:cs="Times New Roman" w:eastAsia="Times New Roman" w:hAnsi="Times New Roman"/>
-                <w:sz w:val="15"/>
-                <w:szCs w:val="15"/>
-              </w:rPr>
-              <w:t xml:space="preserve">Conformal</w:t>
-            </w:r>
-          </w:p>
-        </w:tc>
-        <w:tc>
-          <w:tcPr>
-            <w:tcW w:type="dxa" w:w="3400"/>
-            <w:tcBorders>
-              <w:top w:val="none" w:color="FFFFFF" w:sz="0"/>
-              <w:left w:val="none" w:color="FFFFFF" w:sz="0"/>
-              <w:bottom w:val="none" w:color="FFFFFF" w:sz="0"/>
-              <w:right w:val="none" w:color="FFFFFF" w:sz="0"/>
-            </w:tcBorders>
-            <w:tcMar>
-              <w:top w:type="dxa" w:w="30"/>
-              <w:left w:type="dxa" w:w="70"/>
-              <w:bottom w:type="dxa" w:w="30"/>
-              <w:right w:type="dxa" w:w="70"/>
-            </w:tcMar>
-            <w:vAlign w:val="top"/>
-          </w:tcPr>
-          <w:p>
-            <w:pPr>
-              <w:spacing w:after="0"/>
-            </w:pPr>
-            <w:r>
-              <w:rPr>
-                <w:rFonts w:ascii="Times New Roman" w:cs="Times New Roman" w:eastAsia="Times New Roman" w:hAnsi="Times New Roman"/>
-                <w:sz w:val="15"/>
-                <w:szCs w:val="15"/>
-              </w:rPr>
-              <w:t xml:space="preserve">α ∈ {0.01, 0.05, 0.10, 0.20}; noise band = ±2 s.d. of a binomial coverage estimate, n = 175</w:t>
-            </w:r>
-          </w:p>
-        </w:tc>
-      </w:tr>
-      <w:tr>
-        <w:trPr>
-          <w:tblHeader w:val="false"/>
-        </w:trPr>
-        <w:tc>
-          <w:tcPr>
-            <w:tcW w:type="dxa" w:w="1450"/>
-            <w:tcBorders>
-              <w:top w:val="none" w:color="FFFFFF" w:sz="0"/>
-              <w:left w:val="none" w:color="FFFFFF" w:sz="0"/>
-              <w:bottom w:val="single" w:color="000000" w:sz="8"/>
-              <w:right w:val="none" w:color="FFFFFF" w:sz="0"/>
-            </w:tcBorders>
-            <w:tcMar>
-              <w:top w:type="dxa" w:w="30"/>
-              <w:left w:type="dxa" w:w="70"/>
-              <w:bottom w:type="dxa" w:w="30"/>
-              <w:right w:type="dxa" w:w="70"/>
-            </w:tcMar>
-            <w:vAlign w:val="top"/>
-          </w:tcPr>
-          <w:p>
-            <w:pPr>
-              <w:spacing w:after="0"/>
-            </w:pPr>
-            <w:r>
-              <w:rPr>
-                <w:rFonts w:ascii="Times New Roman" w:cs="Times New Roman" w:eastAsia="Times New Roman" w:hAnsi="Times New Roman"/>
-                <w:sz w:val="15"/>
-                <w:szCs w:val="15"/>
-              </w:rPr>
-              <w:t xml:space="preserve">Seeds, hardware</w:t>
-            </w:r>
-          </w:p>
-        </w:tc>
-        <w:tc>
-          <w:tcPr>
-            <w:tcW w:type="dxa" w:w="3400"/>
-            <w:tcBorders>
-              <w:top w:val="none" w:color="FFFFFF" w:sz="0"/>
-              <w:left w:val="none" w:color="FFFFFF" w:sz="0"/>
-              <w:bottom w:val="single" w:color="000000" w:sz="8"/>
-              <w:right w:val="none" w:color="FFFFFF" w:sz="0"/>
-            </w:tcBorders>
-            <w:tcMar>
-              <w:top w:type="dxa" w:w="30"/>
-              <w:left w:type="dxa" w:w="70"/>
-              <w:bottom w:type="dxa" w:w="30"/>
-              <w:right w:type="dxa" w:w="70"/>
-            </w:tcMar>
-            <w:vAlign w:val="top"/>
-          </w:tcPr>
-          <w:p>
-            <w:pPr>
-              <w:spacing w:after="0"/>
-            </w:pPr>
-            <w:r>
-              <w:rPr>
-                <w:rFonts w:ascii="Times New Roman" w:cs="Times New Roman" w:eastAsia="Times New Roman" w:hAnsi="Times New Roman"/>
-                <w:sz w:val="15"/>
-                <w:szCs w:val="15"/>
-              </w:rPr>
-              <w:t xml:space="preserve">seed 42 throughout (stratified 80/20 split); latency on an Intel Core i5-1334U (12 logical CPUs), Windows 11, Python 3.14.3, median of 200 runs after 20 warm-up runs</w:t>
-            </w:r>
-          </w:p>
-        </w:tc>
-      </w:tr>
-    </w:tbl>
-    <w:p>
-      <w:pPr>
-        <w:spacing w:after="60"/>
-      </w:pPr>
+        <w:t xml:space="preserve">Table IV (Appendix D) gives the configuration of every component. Latency is the warm median per ticket at batch size one.</w:t>
+      </w:r>
     </w:p>
     <w:p>
       <w:pPr>
@@ -10848,32 +9298,7 @@
           <w:sz w:val="20"/>
           <w:szCs w:val="20"/>
         </w:rPr>
-        <w:t xml:space="preserve">, training on the corpus does not transfer to out-of-template phrasing better than no training at all (Section VI-C).</w:t>
-      </w:r>
-    </w:p>
-    <w:p>
-      <w:pPr>
-        <w:spacing w:after="0" w:line="228"/>
-        <w:ind w:firstLine="245"/>
-        <w:jc w:val="both"/>
-      </w:pPr>
-      <w:r>
-        <w:rPr>
-          <w:rFonts w:ascii="Times New Roman" w:cs="Times New Roman" w:eastAsia="Times New Roman" w:hAnsi="Times New Roman"/>
-          <w:b/>
-          <w:bCs/>
-          <w:sz w:val="20"/>
-          <w:szCs w:val="20"/>
-        </w:rPr>
-        <w:t xml:space="preserve">Methodological lessons.</w:t>
-      </w:r>
-      <w:r>
-        <w:rPr>
-          <w:rFonts w:ascii="Times New Roman" w:cs="Times New Roman" w:eastAsia="Times New Roman" w:hAnsi="Times New Roman"/>
-          <w:sz w:val="20"/>
-          <w:szCs w:val="20"/>
-        </w:rPr>
-        <w:t xml:space="preserve"> An area-under-the-risk–coverage metric showed effects that the pre-registered comparison at the live operating coverage could not resolve, so an averaged metric alone is not a reason to adopt a deferral rule. A pre-registered degeneracy rule blocked our paraphrase-shift experiment, and we kept the rule after seeing the results even though a critique of it was reasonable. On nine occasions a value or artifact was wrong for its context yet internally consistent and silently produced a wrong result; each case is documented in the repository.</w:t>
+        <w:t xml:space="preserve">, training on the corpus does not transfer to out-of-template phrasing better than no training at all (Section VI-C). Methodological lessons from these experiments are summarised in Appendix F.</w:t>
       </w:r>
     </w:p>
     <w:p>
@@ -14851,6 +13276,1635 @@
         </w:tc>
       </w:tr>
     </w:tbl>
+    <w:p>
+      <w:pPr>
+        <w:spacing w:after="100" w:before="200"/>
+        <w:jc w:val="center"/>
+      </w:pPr>
+      <w:r>
+        <w:rPr>
+          <w:rFonts w:ascii="Times New Roman" w:cs="Times New Roman" w:eastAsia="Times New Roman" w:hAnsi="Times New Roman"/>
+          <w:smallCaps/>
+          <w:sz w:val="20"/>
+          <w:szCs w:val="20"/>
+        </w:rPr>
+        <w:t xml:space="preserve">Appendix D: Model Configurations and Hyperparameters</w:t>
+      </w:r>
+    </w:p>
+    <w:p>
+      <w:pPr>
+        <w:keepNext/>
+        <w:spacing w:after="0" w:before="160"/>
+        <w:jc w:val="center"/>
+      </w:pPr>
+      <w:r>
+        <w:rPr>
+          <w:rFonts w:ascii="Times New Roman" w:cs="Times New Roman" w:eastAsia="Times New Roman" w:hAnsi="Times New Roman"/>
+          <w:sz w:val="16"/>
+          <w:szCs w:val="16"/>
+        </w:rPr>
+        <w:t xml:space="preserve">TABLE IV</w:t>
+      </w:r>
+    </w:p>
+    <w:p>
+      <w:pPr>
+        <w:keepNext/>
+        <w:spacing w:after="80"/>
+        <w:jc w:val="center"/>
+      </w:pPr>
+      <w:r>
+        <w:rPr>
+          <w:rFonts w:ascii="Times New Roman" w:cs="Times New Roman" w:eastAsia="Times New Roman" w:hAnsi="Times New Roman"/>
+          <w:smallCaps/>
+          <w:sz w:val="16"/>
+          <w:szCs w:val="16"/>
+        </w:rPr>
+        <w:t xml:space="preserve">Model configurations and hyperparameters</w:t>
+      </w:r>
+    </w:p>
+    <w:tbl>
+      <w:tblPr>
+        <w:tblW w:type="dxa" w:w="4850"/>
+        <w:jc w:val="center"/>
+        <w:tblBorders>
+          <w:top w:val="none" w:color="FFFFFF" w:sz="0"/>
+          <w:left w:val="none" w:color="FFFFFF" w:sz="0"/>
+          <w:bottom w:val="none" w:color="FFFFFF" w:sz="0"/>
+          <w:right w:val="none" w:color="FFFFFF" w:sz="0"/>
+          <w:insideH w:val="none" w:color="FFFFFF" w:sz="0"/>
+          <w:insideV w:val="none" w:color="FFFFFF" w:sz="0"/>
+        </w:tblBorders>
+      </w:tblPr>
+      <w:tblGrid>
+        <w:gridCol w:w="1450"/>
+        <w:gridCol w:w="3400"/>
+      </w:tblGrid>
+      <w:tr>
+        <w:trPr>
+          <w:tblHeader/>
+        </w:trPr>
+        <w:tc>
+          <w:tcPr>
+            <w:tcW w:type="dxa" w:w="1450"/>
+            <w:tcBorders>
+              <w:top w:val="single" w:color="000000" w:sz="8"/>
+              <w:left w:val="none" w:color="FFFFFF" w:sz="0"/>
+              <w:bottom w:val="single" w:color="000000" w:sz="4"/>
+              <w:right w:val="none" w:color="FFFFFF" w:sz="0"/>
+            </w:tcBorders>
+            <w:tcMar>
+              <w:top w:type="dxa" w:w="30"/>
+              <w:left w:type="dxa" w:w="70"/>
+              <w:bottom w:type="dxa" w:w="30"/>
+              <w:right w:type="dxa" w:w="70"/>
+            </w:tcMar>
+            <w:vAlign w:val="top"/>
+          </w:tcPr>
+          <w:p>
+            <w:pPr>
+              <w:spacing w:after="0"/>
+            </w:pPr>
+            <w:r>
+              <w:rPr>
+                <w:rFonts w:ascii="Times New Roman" w:cs="Times New Roman" w:eastAsia="Times New Roman" w:hAnsi="Times New Roman"/>
+                <w:b/>
+                <w:bCs/>
+                <w:sz w:val="15"/>
+                <w:szCs w:val="15"/>
+              </w:rPr>
+              <w:t xml:space="preserve">Component</w:t>
+            </w:r>
+          </w:p>
+        </w:tc>
+        <w:tc>
+          <w:tcPr>
+            <w:tcW w:type="dxa" w:w="3400"/>
+            <w:tcBorders>
+              <w:top w:val="single" w:color="000000" w:sz="8"/>
+              <w:left w:val="none" w:color="FFFFFF" w:sz="0"/>
+              <w:bottom w:val="single" w:color="000000" w:sz="4"/>
+              <w:right w:val="none" w:color="FFFFFF" w:sz="0"/>
+            </w:tcBorders>
+            <w:tcMar>
+              <w:top w:type="dxa" w:w="30"/>
+              <w:left w:type="dxa" w:w="70"/>
+              <w:bottom w:type="dxa" w:w="30"/>
+              <w:right w:type="dxa" w:w="70"/>
+            </w:tcMar>
+            <w:vAlign w:val="top"/>
+          </w:tcPr>
+          <w:p>
+            <w:pPr>
+              <w:spacing w:after="0"/>
+            </w:pPr>
+            <w:r>
+              <w:rPr>
+                <w:rFonts w:ascii="Times New Roman" w:cs="Times New Roman" w:eastAsia="Times New Roman" w:hAnsi="Times New Roman"/>
+                <w:b/>
+                <w:bCs/>
+                <w:sz w:val="15"/>
+                <w:szCs w:val="15"/>
+              </w:rPr>
+              <w:t xml:space="preserve">Configuration</w:t>
+            </w:r>
+          </w:p>
+        </w:tc>
+      </w:tr>
+      <w:tr>
+        <w:trPr>
+          <w:tblHeader w:val="false"/>
+        </w:trPr>
+        <w:tc>
+          <w:tcPr>
+            <w:tcW w:type="dxa" w:w="1450"/>
+            <w:tcBorders>
+              <w:top w:val="none" w:color="FFFFFF" w:sz="0"/>
+              <w:left w:val="none" w:color="FFFFFF" w:sz="0"/>
+              <w:bottom w:val="none" w:color="FFFFFF" w:sz="0"/>
+              <w:right w:val="none" w:color="FFFFFF" w:sz="0"/>
+            </w:tcBorders>
+            <w:tcMar>
+              <w:top w:type="dxa" w:w="30"/>
+              <w:left w:type="dxa" w:w="70"/>
+              <w:bottom w:type="dxa" w:w="30"/>
+              <w:right w:type="dxa" w:w="70"/>
+            </w:tcMar>
+            <w:vAlign w:val="top"/>
+          </w:tcPr>
+          <w:p>
+            <w:pPr>
+              <w:spacing w:after="0"/>
+            </w:pPr>
+            <w:r>
+              <w:rPr>
+                <w:rFonts w:ascii="Times New Roman" w:cs="Times New Roman" w:eastAsia="Times New Roman" w:hAnsi="Times New Roman"/>
+                <w:sz w:val="15"/>
+                <w:szCs w:val="15"/>
+              </w:rPr>
+              <w:t xml:space="preserve">Tier 1</w:t>
+            </w:r>
+          </w:p>
+        </w:tc>
+        <w:tc>
+          <w:tcPr>
+            <w:tcW w:type="dxa" w:w="3400"/>
+            <w:tcBorders>
+              <w:top w:val="none" w:color="FFFFFF" w:sz="0"/>
+              <w:left w:val="none" w:color="FFFFFF" w:sz="0"/>
+              <w:bottom w:val="none" w:color="FFFFFF" w:sz="0"/>
+              <w:right w:val="none" w:color="FFFFFF" w:sz="0"/>
+            </w:tcBorders>
+            <w:tcMar>
+              <w:top w:type="dxa" w:w="30"/>
+              <w:left w:type="dxa" w:w="70"/>
+              <w:bottom w:type="dxa" w:w="30"/>
+              <w:right w:type="dxa" w:w="70"/>
+            </w:tcMar>
+            <w:vAlign w:val="top"/>
+          </w:tcPr>
+          <w:p>
+            <w:pPr>
+              <w:spacing w:after="0"/>
+            </w:pPr>
+            <w:r>
+              <w:rPr>
+                <w:rFonts w:ascii="Times New Roman" w:cs="Times New Roman" w:eastAsia="Times New Roman" w:hAnsi="Times New Roman"/>
+                <w:sz w:val="15"/>
+                <w:szCs w:val="15"/>
+              </w:rPr>
+              <w:t xml:space="preserve">TF-IDF, committed vocabulary of 5,000 features, </w:t>
+            </w:r>
+            <w:r>
+              <w:rPr>
+                <w:rFonts w:ascii="Times New Roman" w:cs="Times New Roman" w:eastAsia="Times New Roman" w:hAnsi="Times New Roman"/>
+                <w:sz w:val="15"/>
+                <w:szCs w:val="15"/>
+              </w:rPr>
+              <w:t xml:space="preserve">unigrams and bigrams, English stop words removed</w:t>
+            </w:r>
+            <w:r>
+              <w:rPr>
+                <w:rFonts w:ascii="Times New Roman" w:cs="Times New Roman" w:eastAsia="Times New Roman" w:hAnsi="Times New Roman"/>
+                <w:sz w:val="15"/>
+                <w:szCs w:val="15"/>
+              </w:rPr>
+              <w:t xml:space="preserve">; logistic regression, </w:t>
+            </w:r>
+            <w:r>
+              <w:rPr>
+                <w:rFonts w:ascii="Times New Roman" w:cs="Times New Roman" w:eastAsia="Times New Roman" w:hAnsi="Times New Roman"/>
+                <w:sz w:val="15"/>
+                <w:szCs w:val="15"/>
+              </w:rPr>
+              <w:t xml:space="preserve">max_iter = 1000; otherwise scikit-learn defaults (L2, C = 1.0, lbfgs)</w:t>
+            </w:r>
+          </w:p>
+        </w:tc>
+      </w:tr>
+      <w:tr>
+        <w:trPr>
+          <w:tblHeader w:val="false"/>
+        </w:trPr>
+        <w:tc>
+          <w:tcPr>
+            <w:tcW w:type="dxa" w:w="1450"/>
+            <w:tcBorders>
+              <w:top w:val="none" w:color="FFFFFF" w:sz="0"/>
+              <w:left w:val="none" w:color="FFFFFF" w:sz="0"/>
+              <w:bottom w:val="none" w:color="FFFFFF" w:sz="0"/>
+              <w:right w:val="none" w:color="FFFFFF" w:sz="0"/>
+            </w:tcBorders>
+            <w:tcMar>
+              <w:top w:type="dxa" w:w="30"/>
+              <w:left w:type="dxa" w:w="70"/>
+              <w:bottom w:type="dxa" w:w="30"/>
+              <w:right w:type="dxa" w:w="70"/>
+            </w:tcMar>
+            <w:vAlign w:val="top"/>
+          </w:tcPr>
+          <w:p>
+            <w:pPr>
+              <w:spacing w:after="0"/>
+            </w:pPr>
+            <w:r>
+              <w:rPr>
+                <w:rFonts w:ascii="Times New Roman" w:cs="Times New Roman" w:eastAsia="Times New Roman" w:hAnsi="Times New Roman"/>
+                <w:sz w:val="15"/>
+                <w:szCs w:val="15"/>
+              </w:rPr>
+              <w:t xml:space="preserve">Tier 2</w:t>
+            </w:r>
+          </w:p>
+        </w:tc>
+        <w:tc>
+          <w:tcPr>
+            <w:tcW w:type="dxa" w:w="3400"/>
+            <w:tcBorders>
+              <w:top w:val="none" w:color="FFFFFF" w:sz="0"/>
+              <w:left w:val="none" w:color="FFFFFF" w:sz="0"/>
+              <w:bottom w:val="none" w:color="FFFFFF" w:sz="0"/>
+              <w:right w:val="none" w:color="FFFFFF" w:sz="0"/>
+            </w:tcBorders>
+            <w:tcMar>
+              <w:top w:type="dxa" w:w="30"/>
+              <w:left w:type="dxa" w:w="70"/>
+              <w:bottom w:type="dxa" w:w="30"/>
+              <w:right w:type="dxa" w:w="70"/>
+            </w:tcMar>
+            <w:vAlign w:val="top"/>
+          </w:tcPr>
+          <w:p>
+            <w:pPr>
+              <w:spacing w:after="0"/>
+            </w:pPr>
+            <w:r>
+              <w:rPr>
+                <w:rFonts w:ascii="Times New Roman" w:cs="Times New Roman" w:eastAsia="Times New Roman" w:hAnsi="Times New Roman"/>
+                <w:sz w:val="15"/>
+                <w:szCs w:val="15"/>
+              </w:rPr>
+              <w:t xml:space="preserve">bge-base-en-v1.5 (768-d, frozen) + logistic regression, </w:t>
+            </w:r>
+            <w:r>
+              <w:rPr>
+                <w:rFonts w:ascii="Times New Roman" w:cs="Times New Roman" w:eastAsia="Times New Roman" w:hAnsi="Times New Roman"/>
+                <w:sz w:val="15"/>
+                <w:szCs w:val="15"/>
+              </w:rPr>
+              <w:t xml:space="preserve">max_iter = 1000, scikit-learn defaults, fitted on the 3,200-row split</w:t>
+            </w:r>
+          </w:p>
+        </w:tc>
+      </w:tr>
+      <w:tr>
+        <w:trPr>
+          <w:tblHeader w:val="false"/>
+        </w:trPr>
+        <w:tc>
+          <w:tcPr>
+            <w:tcW w:type="dxa" w:w="1450"/>
+            <w:tcBorders>
+              <w:top w:val="none" w:color="FFFFFF" w:sz="0"/>
+              <w:left w:val="none" w:color="FFFFFF" w:sz="0"/>
+              <w:bottom w:val="none" w:color="FFFFFF" w:sz="0"/>
+              <w:right w:val="none" w:color="FFFFFF" w:sz="0"/>
+            </w:tcBorders>
+            <w:tcMar>
+              <w:top w:type="dxa" w:w="30"/>
+              <w:left w:type="dxa" w:w="70"/>
+              <w:bottom w:type="dxa" w:w="30"/>
+              <w:right w:type="dxa" w:w="70"/>
+            </w:tcMar>
+            <w:vAlign w:val="top"/>
+          </w:tcPr>
+          <w:p>
+            <w:pPr>
+              <w:spacing w:after="0"/>
+            </w:pPr>
+            <w:r>
+              <w:rPr>
+                <w:rFonts w:ascii="Times New Roman" w:cs="Times New Roman" w:eastAsia="Times New Roman" w:hAnsi="Times New Roman"/>
+                <w:sz w:val="15"/>
+                <w:szCs w:val="15"/>
+              </w:rPr>
+              <w:t xml:space="preserve">Cascade gate</w:t>
+            </w:r>
+          </w:p>
+        </w:tc>
+        <w:tc>
+          <w:tcPr>
+            <w:tcW w:type="dxa" w:w="3400"/>
+            <w:tcBorders>
+              <w:top w:val="none" w:color="FFFFFF" w:sz="0"/>
+              <w:left w:val="none" w:color="FFFFFF" w:sz="0"/>
+              <w:bottom w:val="none" w:color="FFFFFF" w:sz="0"/>
+              <w:right w:val="none" w:color="FFFFFF" w:sz="0"/>
+            </w:tcBorders>
+            <w:tcMar>
+              <w:top w:type="dxa" w:w="30"/>
+              <w:left w:type="dxa" w:w="70"/>
+              <w:bottom w:type="dxa" w:w="30"/>
+              <w:right w:type="dxa" w:w="70"/>
+            </w:tcMar>
+            <w:vAlign w:val="top"/>
+          </w:tcPr>
+          <w:p>
+            <w:pPr>
+              <w:spacing w:after="0"/>
+            </w:pPr>
+            <w:r>
+              <w:rPr>
+                <w:rFonts w:ascii="Times New Roman" w:cs="Times New Roman" w:eastAsia="Times New Roman" w:hAnsi="Times New Roman"/>
+                <w:sz w:val="15"/>
+                <w:szCs w:val="15"/>
+              </w:rPr>
+              <w:t xml:space="preserve">Accept Tier-1 label if top-class probability ≥ 0.50</w:t>
+            </w:r>
+          </w:p>
+        </w:tc>
+      </w:tr>
+      <w:tr>
+        <w:trPr>
+          <w:tblHeader w:val="false"/>
+        </w:trPr>
+        <w:tc>
+          <w:tcPr>
+            <w:tcW w:type="dxa" w:w="1450"/>
+            <w:tcBorders>
+              <w:top w:val="none" w:color="FFFFFF" w:sz="0"/>
+              <w:left w:val="none" w:color="FFFFFF" w:sz="0"/>
+              <w:bottom w:val="none" w:color="FFFFFF" w:sz="0"/>
+              <w:right w:val="none" w:color="FFFFFF" w:sz="0"/>
+            </w:tcBorders>
+            <w:tcMar>
+              <w:top w:type="dxa" w:w="30"/>
+              <w:left w:type="dxa" w:w="70"/>
+              <w:bottom w:type="dxa" w:w="30"/>
+              <w:right w:type="dxa" w:w="70"/>
+            </w:tcMar>
+            <w:vAlign w:val="top"/>
+          </w:tcPr>
+          <w:p>
+            <w:pPr>
+              <w:spacing w:after="0"/>
+            </w:pPr>
+            <w:r>
+              <w:rPr>
+                <w:rFonts w:ascii="Times New Roman" w:cs="Times New Roman" w:eastAsia="Times New Roman" w:hAnsi="Times New Roman"/>
+                <w:sz w:val="15"/>
+                <w:szCs w:val="15"/>
+              </w:rPr>
+              <w:t xml:space="preserve">Retrieval</w:t>
+            </w:r>
+          </w:p>
+        </w:tc>
+        <w:tc>
+          <w:tcPr>
+            <w:tcW w:type="dxa" w:w="3400"/>
+            <w:tcBorders>
+              <w:top w:val="none" w:color="FFFFFF" w:sz="0"/>
+              <w:left w:val="none" w:color="FFFFFF" w:sz="0"/>
+              <w:bottom w:val="none" w:color="FFFFFF" w:sz="0"/>
+              <w:right w:val="none" w:color="FFFFFF" w:sz="0"/>
+            </w:tcBorders>
+            <w:tcMar>
+              <w:top w:type="dxa" w:w="30"/>
+              <w:left w:type="dxa" w:w="70"/>
+              <w:bottom w:type="dxa" w:w="30"/>
+              <w:right w:type="dxa" w:w="70"/>
+            </w:tcMar>
+            <w:vAlign w:val="top"/>
+          </w:tcPr>
+          <w:p>
+            <w:pPr>
+              <w:spacing w:after="0"/>
+            </w:pPr>
+            <w:r>
+              <w:rPr>
+                <w:rFonts w:ascii="Times New Roman" w:cs="Times New Roman" w:eastAsia="Times New Roman" w:hAnsi="Times New Roman"/>
+                <w:sz w:val="15"/>
+                <w:szCs w:val="15"/>
+              </w:rPr>
+              <w:t xml:space="preserve">FAISS inner-product index over normalised BGE embeddings; top-5 neighbours</w:t>
+            </w:r>
+          </w:p>
+        </w:tc>
+      </w:tr>
+      <w:tr>
+        <w:trPr>
+          <w:tblHeader w:val="false"/>
+        </w:trPr>
+        <w:tc>
+          <w:tcPr>
+            <w:tcW w:type="dxa" w:w="1450"/>
+            <w:tcBorders>
+              <w:top w:val="none" w:color="FFFFFF" w:sz="0"/>
+              <w:left w:val="none" w:color="FFFFFF" w:sz="0"/>
+              <w:bottom w:val="none" w:color="FFFFFF" w:sz="0"/>
+              <w:right w:val="none" w:color="FFFFFF" w:sz="0"/>
+            </w:tcBorders>
+            <w:tcMar>
+              <w:top w:type="dxa" w:w="30"/>
+              <w:left w:type="dxa" w:w="70"/>
+              <w:bottom w:type="dxa" w:w="30"/>
+              <w:right w:type="dxa" w:w="70"/>
+            </w:tcMar>
+            <w:vAlign w:val="top"/>
+          </w:tcPr>
+          <w:p>
+            <w:pPr>
+              <w:spacing w:after="0"/>
+            </w:pPr>
+            <w:r>
+              <w:rPr>
+                <w:rFonts w:ascii="Times New Roman" w:cs="Times New Roman" w:eastAsia="Times New Roman" w:hAnsi="Times New Roman"/>
+                <w:sz w:val="15"/>
+                <w:szCs w:val="15"/>
+              </w:rPr>
+              <w:t xml:space="preserve">Retrieval gate</w:t>
+            </w:r>
+          </w:p>
+        </w:tc>
+        <w:tc>
+          <w:tcPr>
+            <w:tcW w:type="dxa" w:w="3400"/>
+            <w:tcBorders>
+              <w:top w:val="none" w:color="FFFFFF" w:sz="0"/>
+              <w:left w:val="none" w:color="FFFFFF" w:sz="0"/>
+              <w:bottom w:val="none" w:color="FFFFFF" w:sz="0"/>
+              <w:right w:val="none" w:color="FFFFFF" w:sz="0"/>
+            </w:tcBorders>
+            <w:tcMar>
+              <w:top w:type="dxa" w:w="30"/>
+              <w:left w:type="dxa" w:w="70"/>
+              <w:bottom w:type="dxa" w:w="30"/>
+              <w:right w:type="dxa" w:w="70"/>
+            </w:tcMar>
+            <w:vAlign w:val="top"/>
+          </w:tcPr>
+          <w:p>
+            <w:pPr>
+              <w:spacing w:after="0"/>
+            </w:pPr>
+            <w:r>
+              <w:rPr>
+                <w:rFonts w:ascii="Times New Roman" w:cs="Times New Roman" w:eastAsia="Times New Roman" w:hAnsi="Times New Roman"/>
+                <w:sz w:val="15"/>
+                <w:szCs w:val="15"/>
+              </w:rPr>
+              <w:t xml:space="preserve">Draft only if top-1 cosine similarity ≥ 0.67</w:t>
+            </w:r>
+          </w:p>
+        </w:tc>
+      </w:tr>
+      <w:tr>
+        <w:trPr>
+          <w:tblHeader w:val="false"/>
+        </w:trPr>
+        <w:tc>
+          <w:tcPr>
+            <w:tcW w:type="dxa" w:w="1450"/>
+            <w:tcBorders>
+              <w:top w:val="none" w:color="FFFFFF" w:sz="0"/>
+              <w:left w:val="none" w:color="FFFFFF" w:sz="0"/>
+              <w:bottom w:val="none" w:color="FFFFFF" w:sz="0"/>
+              <w:right w:val="none" w:color="FFFFFF" w:sz="0"/>
+            </w:tcBorders>
+            <w:tcMar>
+              <w:top w:type="dxa" w:w="30"/>
+              <w:left w:type="dxa" w:w="70"/>
+              <w:bottom w:type="dxa" w:w="30"/>
+              <w:right w:type="dxa" w:w="70"/>
+            </w:tcMar>
+            <w:vAlign w:val="top"/>
+          </w:tcPr>
+          <w:p>
+            <w:pPr>
+              <w:spacing w:after="0"/>
+            </w:pPr>
+            <w:r>
+              <w:rPr>
+                <w:rFonts w:ascii="Times New Roman" w:cs="Times New Roman" w:eastAsia="Times New Roman" w:hAnsi="Times New Roman"/>
+                <w:sz w:val="15"/>
+                <w:szCs w:val="15"/>
+              </w:rPr>
+              <w:t xml:space="preserve">Drafting LLM</w:t>
+            </w:r>
+          </w:p>
+        </w:tc>
+        <w:tc>
+          <w:tcPr>
+            <w:tcW w:type="dxa" w:w="3400"/>
+            <w:tcBorders>
+              <w:top w:val="none" w:color="FFFFFF" w:sz="0"/>
+              <w:left w:val="none" w:color="FFFFFF" w:sz="0"/>
+              <w:bottom w:val="none" w:color="FFFFFF" w:sz="0"/>
+              <w:right w:val="none" w:color="FFFFFF" w:sz="0"/>
+            </w:tcBorders>
+            <w:tcMar>
+              <w:top w:type="dxa" w:w="30"/>
+              <w:left w:type="dxa" w:w="70"/>
+              <w:bottom w:type="dxa" w:w="30"/>
+              <w:right w:type="dxa" w:w="70"/>
+            </w:tcMar>
+            <w:vAlign w:val="top"/>
+          </w:tcPr>
+          <w:p>
+            <w:pPr>
+              <w:spacing w:after="0"/>
+            </w:pPr>
+            <w:r>
+              <w:rPr>
+                <w:rFonts w:ascii="Times New Roman" w:cs="Times New Roman" w:eastAsia="Times New Roman" w:hAnsi="Times New Roman"/>
+                <w:sz w:val="15"/>
+                <w:szCs w:val="15"/>
+              </w:rPr>
+              <w:t xml:space="preserve">gemini-flash-lite, </w:t>
+            </w:r>
+            <w:r>
+              <w:rPr>
+                <w:rFonts w:ascii="Times New Roman" w:cs="Times New Roman" w:eastAsia="Times New Roman" w:hAnsi="Times New Roman"/>
+                <w:sz w:val="15"/>
+                <w:szCs w:val="15"/>
+              </w:rPr>
+              <w:t xml:space="preserve">API defaults (no generation config set); zero-shot runs at temperature 0.0</w:t>
+            </w:r>
+          </w:p>
+        </w:tc>
+      </w:tr>
+      <w:tr>
+        <w:trPr>
+          <w:tblHeader w:val="false"/>
+        </w:trPr>
+        <w:tc>
+          <w:tcPr>
+            <w:tcW w:type="dxa" w:w="1450"/>
+            <w:tcBorders>
+              <w:top w:val="none" w:color="FFFFFF" w:sz="0"/>
+              <w:left w:val="none" w:color="FFFFFF" w:sz="0"/>
+              <w:bottom w:val="none" w:color="FFFFFF" w:sz="0"/>
+              <w:right w:val="none" w:color="FFFFFF" w:sz="0"/>
+            </w:tcBorders>
+            <w:tcMar>
+              <w:top w:type="dxa" w:w="30"/>
+              <w:left w:type="dxa" w:w="70"/>
+              <w:bottom w:type="dxa" w:w="30"/>
+              <w:right w:type="dxa" w:w="70"/>
+            </w:tcMar>
+            <w:vAlign w:val="top"/>
+          </w:tcPr>
+          <w:p>
+            <w:pPr>
+              <w:spacing w:after="0"/>
+            </w:pPr>
+            <w:r>
+              <w:rPr>
+                <w:rFonts w:ascii="Times New Roman" w:cs="Times New Roman" w:eastAsia="Times New Roman" w:hAnsi="Times New Roman"/>
+                <w:sz w:val="15"/>
+                <w:szCs w:val="15"/>
+              </w:rPr>
+              <w:t xml:space="preserve">Zero-shot baselines</w:t>
+            </w:r>
+          </w:p>
+        </w:tc>
+        <w:tc>
+          <w:tcPr>
+            <w:tcW w:type="dxa" w:w="3400"/>
+            <w:tcBorders>
+              <w:top w:val="none" w:color="FFFFFF" w:sz="0"/>
+              <w:left w:val="none" w:color="FFFFFF" w:sz="0"/>
+              <w:bottom w:val="none" w:color="FFFFFF" w:sz="0"/>
+              <w:right w:val="none" w:color="FFFFFF" w:sz="0"/>
+            </w:tcBorders>
+            <w:tcMar>
+              <w:top w:type="dxa" w:w="30"/>
+              <w:left w:type="dxa" w:w="70"/>
+              <w:bottom w:type="dxa" w:w="30"/>
+              <w:right w:type="dxa" w:w="70"/>
+            </w:tcMar>
+            <w:vAlign w:val="top"/>
+          </w:tcPr>
+          <w:p>
+            <w:pPr>
+              <w:spacing w:after="0"/>
+            </w:pPr>
+            <w:r>
+              <w:rPr>
+                <w:rFonts w:ascii="Times New Roman" w:cs="Times New Roman" w:eastAsia="Times New Roman" w:hAnsi="Times New Roman"/>
+                <w:sz w:val="15"/>
+                <w:szCs w:val="15"/>
+              </w:rPr>
+              <w:t xml:space="preserve">gemini-flash-lite and Qwen2.5-3B (local CPU) with byte-identical prompts</w:t>
+            </w:r>
+          </w:p>
+        </w:tc>
+      </w:tr>
+      <w:tr>
+        <w:trPr>
+          <w:tblHeader w:val="false"/>
+        </w:trPr>
+        <w:tc>
+          <w:tcPr>
+            <w:tcW w:type="dxa" w:w="1450"/>
+            <w:tcBorders>
+              <w:top w:val="none" w:color="FFFFFF" w:sz="0"/>
+              <w:left w:val="none" w:color="FFFFFF" w:sz="0"/>
+              <w:bottom w:val="none" w:color="FFFFFF" w:sz="0"/>
+              <w:right w:val="none" w:color="FFFFFF" w:sz="0"/>
+            </w:tcBorders>
+            <w:tcMar>
+              <w:top w:type="dxa" w:w="30"/>
+              <w:left w:type="dxa" w:w="70"/>
+              <w:bottom w:type="dxa" w:w="30"/>
+              <w:right w:type="dxa" w:w="70"/>
+            </w:tcMar>
+            <w:vAlign w:val="top"/>
+          </w:tcPr>
+          <w:p>
+            <w:pPr>
+              <w:spacing w:after="0"/>
+            </w:pPr>
+            <w:r>
+              <w:rPr>
+                <w:rFonts w:ascii="Times New Roman" w:cs="Times New Roman" w:eastAsia="Times New Roman" w:hAnsi="Times New Roman"/>
+                <w:sz w:val="15"/>
+                <w:szCs w:val="15"/>
+              </w:rPr>
+              <w:t xml:space="preserve">Other encoders</w:t>
+            </w:r>
+          </w:p>
+        </w:tc>
+        <w:tc>
+          <w:tcPr>
+            <w:tcW w:type="dxa" w:w="3400"/>
+            <w:tcBorders>
+              <w:top w:val="none" w:color="FFFFFF" w:sz="0"/>
+              <w:left w:val="none" w:color="FFFFFF" w:sz="0"/>
+              <w:bottom w:val="none" w:color="FFFFFF" w:sz="0"/>
+              <w:right w:val="none" w:color="FFFFFF" w:sz="0"/>
+            </w:tcBorders>
+            <w:tcMar>
+              <w:top w:type="dxa" w:w="30"/>
+              <w:left w:type="dxa" w:w="70"/>
+              <w:bottom w:type="dxa" w:w="30"/>
+              <w:right w:type="dxa" w:w="70"/>
+            </w:tcMar>
+            <w:vAlign w:val="top"/>
+          </w:tcPr>
+          <w:p>
+            <w:pPr>
+              <w:spacing w:after="0"/>
+            </w:pPr>
+            <w:r>
+              <w:rPr>
+                <w:rFonts w:ascii="Times New Roman" w:cs="Times New Roman" w:eastAsia="Times New Roman" w:hAnsi="Times New Roman"/>
+                <w:sz w:val="15"/>
+                <w:szCs w:val="15"/>
+              </w:rPr>
+              <w:t xml:space="preserve">MiniLM and E5 with the same logistic head; DistilBERT fine-tuned, </w:t>
+            </w:r>
+            <w:r>
+              <w:rPr>
+                <w:rFonts w:ascii="Times New Roman" w:cs="Times New Roman" w:eastAsia="Times New Roman" w:hAnsi="Times New Roman"/>
+                <w:sz w:val="15"/>
+                <w:szCs w:val="15"/>
+              </w:rPr>
+              <w:t xml:space="preserve">4 epochs, learning rate 2 × 10⁻⁵, batch size 16, maximum length 128, weight decay 0.01</w:t>
+            </w:r>
+          </w:p>
+        </w:tc>
+      </w:tr>
+      <w:tr>
+        <w:trPr>
+          <w:tblHeader w:val="false"/>
+        </w:trPr>
+        <w:tc>
+          <w:tcPr>
+            <w:tcW w:type="dxa" w:w="1450"/>
+            <w:tcBorders>
+              <w:top w:val="none" w:color="FFFFFF" w:sz="0"/>
+              <w:left w:val="none" w:color="FFFFFF" w:sz="0"/>
+              <w:bottom w:val="none" w:color="FFFFFF" w:sz="0"/>
+              <w:right w:val="none" w:color="FFFFFF" w:sz="0"/>
+            </w:tcBorders>
+            <w:tcMar>
+              <w:top w:type="dxa" w:w="30"/>
+              <w:left w:type="dxa" w:w="70"/>
+              <w:bottom w:type="dxa" w:w="30"/>
+              <w:right w:type="dxa" w:w="70"/>
+            </w:tcMar>
+            <w:vAlign w:val="top"/>
+          </w:tcPr>
+          <w:p>
+            <w:pPr>
+              <w:spacing w:after="0"/>
+            </w:pPr>
+            <w:r>
+              <w:rPr>
+                <w:rFonts w:ascii="Times New Roman" w:cs="Times New Roman" w:eastAsia="Times New Roman" w:hAnsi="Times New Roman"/>
+                <w:sz w:val="15"/>
+                <w:szCs w:val="15"/>
+              </w:rPr>
+              <w:t xml:space="preserve">Clustering</w:t>
+            </w:r>
+          </w:p>
+        </w:tc>
+        <w:tc>
+          <w:tcPr>
+            <w:tcW w:type="dxa" w:w="3400"/>
+            <w:tcBorders>
+              <w:top w:val="none" w:color="FFFFFF" w:sz="0"/>
+              <w:left w:val="none" w:color="FFFFFF" w:sz="0"/>
+              <w:bottom w:val="none" w:color="FFFFFF" w:sz="0"/>
+              <w:right w:val="none" w:color="FFFFFF" w:sz="0"/>
+            </w:tcBorders>
+            <w:tcMar>
+              <w:top w:type="dxa" w:w="30"/>
+              <w:left w:type="dxa" w:w="70"/>
+              <w:bottom w:type="dxa" w:w="30"/>
+              <w:right w:type="dxa" w:w="70"/>
+            </w:tcMar>
+            <w:vAlign w:val="top"/>
+          </w:tcPr>
+          <w:p>
+            <w:pPr>
+              <w:spacing w:after="0"/>
+            </w:pPr>
+            <w:r>
+              <w:rPr>
+                <w:rFonts w:ascii="Times New Roman" w:cs="Times New Roman" w:eastAsia="Times New Roman" w:hAnsi="Times New Roman"/>
+                <w:sz w:val="15"/>
+                <w:szCs w:val="15"/>
+              </w:rPr>
+              <w:t xml:space="preserve">Resolution embeddings, similarity threshold 0.80, union-find grouping</w:t>
+            </w:r>
+          </w:p>
+        </w:tc>
+      </w:tr>
+      <w:tr>
+        <w:trPr>
+          <w:tblHeader w:val="false"/>
+        </w:trPr>
+        <w:tc>
+          <w:tcPr>
+            <w:tcW w:type="dxa" w:w="1450"/>
+            <w:tcBorders>
+              <w:top w:val="none" w:color="FFFFFF" w:sz="0"/>
+              <w:left w:val="none" w:color="FFFFFF" w:sz="0"/>
+              <w:bottom w:val="none" w:color="FFFFFF" w:sz="0"/>
+              <w:right w:val="none" w:color="FFFFFF" w:sz="0"/>
+            </w:tcBorders>
+            <w:tcMar>
+              <w:top w:type="dxa" w:w="30"/>
+              <w:left w:type="dxa" w:w="70"/>
+              <w:bottom w:type="dxa" w:w="30"/>
+              <w:right w:type="dxa" w:w="70"/>
+            </w:tcMar>
+            <w:vAlign w:val="top"/>
+          </w:tcPr>
+          <w:p>
+            <w:pPr>
+              <w:spacing w:after="0"/>
+            </w:pPr>
+            <w:r>
+              <w:rPr>
+                <w:rFonts w:ascii="Times New Roman" w:cs="Times New Roman" w:eastAsia="Times New Roman" w:hAnsi="Times New Roman"/>
+                <w:sz w:val="15"/>
+                <w:szCs w:val="15"/>
+              </w:rPr>
+              <w:t xml:space="preserve">Conformal</w:t>
+            </w:r>
+          </w:p>
+        </w:tc>
+        <w:tc>
+          <w:tcPr>
+            <w:tcW w:type="dxa" w:w="3400"/>
+            <w:tcBorders>
+              <w:top w:val="none" w:color="FFFFFF" w:sz="0"/>
+              <w:left w:val="none" w:color="FFFFFF" w:sz="0"/>
+              <w:bottom w:val="none" w:color="FFFFFF" w:sz="0"/>
+              <w:right w:val="none" w:color="FFFFFF" w:sz="0"/>
+            </w:tcBorders>
+            <w:tcMar>
+              <w:top w:type="dxa" w:w="30"/>
+              <w:left w:type="dxa" w:w="70"/>
+              <w:bottom w:type="dxa" w:w="30"/>
+              <w:right w:type="dxa" w:w="70"/>
+            </w:tcMar>
+            <w:vAlign w:val="top"/>
+          </w:tcPr>
+          <w:p>
+            <w:pPr>
+              <w:spacing w:after="0"/>
+            </w:pPr>
+            <w:r>
+              <w:rPr>
+                <w:rFonts w:ascii="Times New Roman" w:cs="Times New Roman" w:eastAsia="Times New Roman" w:hAnsi="Times New Roman"/>
+                <w:sz w:val="15"/>
+                <w:szCs w:val="15"/>
+              </w:rPr>
+              <w:t xml:space="preserve">α ∈ {0.01, 0.05, 0.10, 0.20}; noise band = ±2 s.d. of a binomial coverage estimate, n = 175</w:t>
+            </w:r>
+          </w:p>
+        </w:tc>
+      </w:tr>
+      <w:tr>
+        <w:trPr>
+          <w:tblHeader w:val="false"/>
+        </w:trPr>
+        <w:tc>
+          <w:tcPr>
+            <w:tcW w:type="dxa" w:w="1450"/>
+            <w:tcBorders>
+              <w:top w:val="none" w:color="FFFFFF" w:sz="0"/>
+              <w:left w:val="none" w:color="FFFFFF" w:sz="0"/>
+              <w:bottom w:val="single" w:color="000000" w:sz="8"/>
+              <w:right w:val="none" w:color="FFFFFF" w:sz="0"/>
+            </w:tcBorders>
+            <w:tcMar>
+              <w:top w:type="dxa" w:w="30"/>
+              <w:left w:type="dxa" w:w="70"/>
+              <w:bottom w:type="dxa" w:w="30"/>
+              <w:right w:type="dxa" w:w="70"/>
+            </w:tcMar>
+            <w:vAlign w:val="top"/>
+          </w:tcPr>
+          <w:p>
+            <w:pPr>
+              <w:spacing w:after="0"/>
+            </w:pPr>
+            <w:r>
+              <w:rPr>
+                <w:rFonts w:ascii="Times New Roman" w:cs="Times New Roman" w:eastAsia="Times New Roman" w:hAnsi="Times New Roman"/>
+                <w:sz w:val="15"/>
+                <w:szCs w:val="15"/>
+              </w:rPr>
+              <w:t xml:space="preserve">Seeds, hardware</w:t>
+            </w:r>
+          </w:p>
+        </w:tc>
+        <w:tc>
+          <w:tcPr>
+            <w:tcW w:type="dxa" w:w="3400"/>
+            <w:tcBorders>
+              <w:top w:val="none" w:color="FFFFFF" w:sz="0"/>
+              <w:left w:val="none" w:color="FFFFFF" w:sz="0"/>
+              <w:bottom w:val="single" w:color="000000" w:sz="8"/>
+              <w:right w:val="none" w:color="FFFFFF" w:sz="0"/>
+            </w:tcBorders>
+            <w:tcMar>
+              <w:top w:type="dxa" w:w="30"/>
+              <w:left w:type="dxa" w:w="70"/>
+              <w:bottom w:type="dxa" w:w="30"/>
+              <w:right w:type="dxa" w:w="70"/>
+            </w:tcMar>
+            <w:vAlign w:val="top"/>
+          </w:tcPr>
+          <w:p>
+            <w:pPr>
+              <w:spacing w:after="0"/>
+            </w:pPr>
+            <w:r>
+              <w:rPr>
+                <w:rFonts w:ascii="Times New Roman" w:cs="Times New Roman" w:eastAsia="Times New Roman" w:hAnsi="Times New Roman"/>
+                <w:sz w:val="15"/>
+                <w:szCs w:val="15"/>
+              </w:rPr>
+              <w:t xml:space="preserve">seed 42 throughout (stratified 80/20 split); latency on an Intel Core i5-1334U (12 logical CPUs), Windows 11, Python 3.14.3, median of 200 runs after 20 warm-up runs</w:t>
+            </w:r>
+          </w:p>
+        </w:tc>
+      </w:tr>
+    </w:tbl>
+    <w:p>
+      <w:pPr>
+        <w:spacing w:after="60"/>
+      </w:pPr>
+    </w:p>
+    <w:p>
+      <w:pPr>
+        <w:spacing w:after="100" w:before="200"/>
+        <w:jc w:val="center"/>
+      </w:pPr>
+      <w:r>
+        <w:rPr>
+          <w:rFonts w:ascii="Times New Roman" w:cs="Times New Roman" w:eastAsia="Times New Roman" w:hAnsi="Times New Roman"/>
+          <w:smallCaps/>
+          <w:sz w:val="20"/>
+          <w:szCs w:val="20"/>
+        </w:rPr>
+        <w:t xml:space="preserve">Appendix E: Verification Checks</w:t>
+      </w:r>
+    </w:p>
+    <w:p>
+      <w:pPr>
+        <w:keepNext/>
+        <w:spacing w:after="0" w:before="160"/>
+        <w:jc w:val="center"/>
+      </w:pPr>
+      <w:r>
+        <w:rPr>
+          <w:rFonts w:ascii="Times New Roman" w:cs="Times New Roman" w:eastAsia="Times New Roman" w:hAnsi="Times New Roman"/>
+          <w:sz w:val="16"/>
+          <w:szCs w:val="16"/>
+        </w:rPr>
+        <w:t xml:space="preserve">TABLE II</w:t>
+      </w:r>
+    </w:p>
+    <w:p>
+      <w:pPr>
+        <w:keepNext/>
+        <w:spacing w:after="80"/>
+        <w:jc w:val="center"/>
+      </w:pPr>
+      <w:r>
+        <w:rPr>
+          <w:rFonts w:ascii="Times New Roman" w:cs="Times New Roman" w:eastAsia="Times New Roman" w:hAnsi="Times New Roman"/>
+          <w:smallCaps/>
+          <w:sz w:val="16"/>
+          <w:szCs w:val="16"/>
+        </w:rPr>
+        <w:t xml:space="preserve">Checks that run before a result is accepted. A count is given only where a committed file records it</w:t>
+      </w:r>
+    </w:p>
+    <w:tbl>
+      <w:tblPr>
+        <w:tblW w:type="dxa" w:w="4850"/>
+        <w:jc w:val="center"/>
+        <w:tblBorders>
+          <w:top w:val="none" w:color="FFFFFF" w:sz="0"/>
+          <w:left w:val="none" w:color="FFFFFF" w:sz="0"/>
+          <w:bottom w:val="none" w:color="FFFFFF" w:sz="0"/>
+          <w:right w:val="none" w:color="FFFFFF" w:sz="0"/>
+          <w:insideH w:val="none" w:color="FFFFFF" w:sz="0"/>
+          <w:insideV w:val="none" w:color="FFFFFF" w:sz="0"/>
+        </w:tblBorders>
+      </w:tblPr>
+      <w:tblGrid>
+        <w:gridCol w:w="1150"/>
+        <w:gridCol w:w="2850"/>
+        <w:gridCol w:w="850"/>
+      </w:tblGrid>
+      <w:tr>
+        <w:trPr>
+          <w:tblHeader/>
+        </w:trPr>
+        <w:tc>
+          <w:tcPr>
+            <w:tcW w:type="dxa" w:w="1150"/>
+            <w:tcBorders>
+              <w:top w:val="single" w:color="000000" w:sz="8"/>
+              <w:left w:val="none" w:color="FFFFFF" w:sz="0"/>
+              <w:bottom w:val="single" w:color="000000" w:sz="4"/>
+              <w:right w:val="none" w:color="FFFFFF" w:sz="0"/>
+            </w:tcBorders>
+            <w:tcMar>
+              <w:top w:type="dxa" w:w="30"/>
+              <w:left w:type="dxa" w:w="70"/>
+              <w:bottom w:type="dxa" w:w="30"/>
+              <w:right w:type="dxa" w:w="70"/>
+            </w:tcMar>
+            <w:vAlign w:val="top"/>
+          </w:tcPr>
+          <w:p>
+            <w:pPr>
+              <w:spacing w:after="0"/>
+            </w:pPr>
+            <w:r>
+              <w:rPr>
+                <w:rFonts w:ascii="Times New Roman" w:cs="Times New Roman" w:eastAsia="Times New Roman" w:hAnsi="Times New Roman"/>
+                <w:b/>
+                <w:bCs/>
+                <w:sz w:val="15"/>
+                <w:szCs w:val="15"/>
+              </w:rPr>
+              <w:t xml:space="preserve">Check</w:t>
+            </w:r>
+          </w:p>
+        </w:tc>
+        <w:tc>
+          <w:tcPr>
+            <w:tcW w:type="dxa" w:w="2850"/>
+            <w:tcBorders>
+              <w:top w:val="single" w:color="000000" w:sz="8"/>
+              <w:left w:val="none" w:color="FFFFFF" w:sz="0"/>
+              <w:bottom w:val="single" w:color="000000" w:sz="4"/>
+              <w:right w:val="none" w:color="FFFFFF" w:sz="0"/>
+            </w:tcBorders>
+            <w:tcMar>
+              <w:top w:type="dxa" w:w="30"/>
+              <w:left w:type="dxa" w:w="70"/>
+              <w:bottom w:type="dxa" w:w="30"/>
+              <w:right w:type="dxa" w:w="70"/>
+            </w:tcMar>
+            <w:vAlign w:val="top"/>
+          </w:tcPr>
+          <w:p>
+            <w:pPr>
+              <w:spacing w:after="0"/>
+            </w:pPr>
+            <w:r>
+              <w:rPr>
+                <w:rFonts w:ascii="Times New Roman" w:cs="Times New Roman" w:eastAsia="Times New Roman" w:hAnsi="Times New Roman"/>
+                <w:b/>
+                <w:bCs/>
+                <w:sz w:val="15"/>
+                <w:szCs w:val="15"/>
+              </w:rPr>
+              <w:t xml:space="preserve">What it guards</w:t>
+            </w:r>
+          </w:p>
+        </w:tc>
+        <w:tc>
+          <w:tcPr>
+            <w:tcW w:type="dxa" w:w="850"/>
+            <w:tcBorders>
+              <w:top w:val="single" w:color="000000" w:sz="8"/>
+              <w:left w:val="none" w:color="FFFFFF" w:sz="0"/>
+              <w:bottom w:val="single" w:color="000000" w:sz="4"/>
+              <w:right w:val="none" w:color="FFFFFF" w:sz="0"/>
+            </w:tcBorders>
+            <w:tcMar>
+              <w:top w:type="dxa" w:w="30"/>
+              <w:left w:type="dxa" w:w="70"/>
+              <w:bottom w:type="dxa" w:w="30"/>
+              <w:right w:type="dxa" w:w="70"/>
+            </w:tcMar>
+            <w:vAlign w:val="top"/>
+          </w:tcPr>
+          <w:p>
+            <w:pPr>
+              <w:spacing w:after="0"/>
+            </w:pPr>
+            <w:r>
+              <w:rPr>
+                <w:rFonts w:ascii="Times New Roman" w:cs="Times New Roman" w:eastAsia="Times New Roman" w:hAnsi="Times New Roman"/>
+                <w:b/>
+                <w:bCs/>
+                <w:sz w:val="15"/>
+                <w:szCs w:val="15"/>
+              </w:rPr>
+              <w:t xml:space="preserve">Count</w:t>
+            </w:r>
+          </w:p>
+        </w:tc>
+      </w:tr>
+      <w:tr>
+        <w:trPr>
+          <w:tblHeader w:val="false"/>
+        </w:trPr>
+        <w:tc>
+          <w:tcPr>
+            <w:tcW w:type="dxa" w:w="1150"/>
+            <w:tcBorders>
+              <w:top w:val="none" w:color="FFFFFF" w:sz="0"/>
+              <w:left w:val="none" w:color="FFFFFF" w:sz="0"/>
+              <w:bottom w:val="none" w:color="FFFFFF" w:sz="0"/>
+              <w:right w:val="none" w:color="FFFFFF" w:sz="0"/>
+            </w:tcBorders>
+            <w:tcMar>
+              <w:top w:type="dxa" w:w="30"/>
+              <w:left w:type="dxa" w:w="70"/>
+              <w:bottom w:type="dxa" w:w="30"/>
+              <w:right w:type="dxa" w:w="70"/>
+            </w:tcMar>
+            <w:vAlign w:val="top"/>
+          </w:tcPr>
+          <w:p>
+            <w:pPr>
+              <w:spacing w:after="0"/>
+            </w:pPr>
+            <w:r>
+              <w:rPr>
+                <w:rFonts w:ascii="Times New Roman" w:cs="Times New Roman" w:eastAsia="Times New Roman" w:hAnsi="Times New Roman"/>
+                <w:sz w:val="15"/>
+                <w:szCs w:val="15"/>
+              </w:rPr>
+              <w:t xml:space="preserve">Golden parity</w:t>
+            </w:r>
+          </w:p>
+        </w:tc>
+        <w:tc>
+          <w:tcPr>
+            <w:tcW w:type="dxa" w:w="2850"/>
+            <w:tcBorders>
+              <w:top w:val="none" w:color="FFFFFF" w:sz="0"/>
+              <w:left w:val="none" w:color="FFFFFF" w:sz="0"/>
+              <w:bottom w:val="none" w:color="FFFFFF" w:sz="0"/>
+              <w:right w:val="none" w:color="FFFFFF" w:sz="0"/>
+            </w:tcBorders>
+            <w:tcMar>
+              <w:top w:type="dxa" w:w="30"/>
+              <w:left w:type="dxa" w:w="70"/>
+              <w:bottom w:type="dxa" w:w="30"/>
+              <w:right w:type="dxa" w:w="70"/>
+            </w:tcMar>
+            <w:vAlign w:val="top"/>
+          </w:tcPr>
+          <w:p>
+            <w:pPr>
+              <w:spacing w:after="0"/>
+            </w:pPr>
+            <w:r>
+              <w:rPr>
+                <w:rFonts w:ascii="Times New Roman" w:cs="Times New Roman" w:eastAsia="Times New Roman" w:hAnsi="Times New Roman"/>
+                <w:sz w:val="15"/>
+                <w:szCs w:val="15"/>
+              </w:rPr>
+              <w:t xml:space="preserve">Category, tier, escalation and neighbour count equal the recorded decisions exactly</w:t>
+            </w:r>
+          </w:p>
+        </w:tc>
+        <w:tc>
+          <w:tcPr>
+            <w:tcW w:type="dxa" w:w="850"/>
+            <w:tcBorders>
+              <w:top w:val="none" w:color="FFFFFF" w:sz="0"/>
+              <w:left w:val="none" w:color="FFFFFF" w:sz="0"/>
+              <w:bottom w:val="none" w:color="FFFFFF" w:sz="0"/>
+              <w:right w:val="none" w:color="FFFFFF" w:sz="0"/>
+            </w:tcBorders>
+            <w:tcMar>
+              <w:top w:type="dxa" w:w="30"/>
+              <w:left w:type="dxa" w:w="70"/>
+              <w:bottom w:type="dxa" w:w="30"/>
+              <w:right w:type="dxa" w:w="70"/>
+            </w:tcMar>
+            <w:vAlign w:val="top"/>
+          </w:tcPr>
+          <w:p>
+            <w:pPr>
+              <w:spacing w:after="0"/>
+            </w:pPr>
+            <w:r>
+              <w:rPr>
+                <w:rFonts w:ascii="Times New Roman" w:cs="Times New Roman" w:eastAsia="Times New Roman" w:hAnsi="Times New Roman"/>
+                <w:sz w:val="15"/>
+                <w:szCs w:val="15"/>
+              </w:rPr>
+              <w:t xml:space="preserve">54 tickets</w:t>
+            </w:r>
+          </w:p>
+        </w:tc>
+      </w:tr>
+      <w:tr>
+        <w:trPr>
+          <w:tblHeader w:val="false"/>
+        </w:trPr>
+        <w:tc>
+          <w:tcPr>
+            <w:tcW w:type="dxa" w:w="1150"/>
+            <w:tcBorders>
+              <w:top w:val="none" w:color="FFFFFF" w:sz="0"/>
+              <w:left w:val="none" w:color="FFFFFF" w:sz="0"/>
+              <w:bottom w:val="none" w:color="FFFFFF" w:sz="0"/>
+              <w:right w:val="none" w:color="FFFFFF" w:sz="0"/>
+            </w:tcBorders>
+            <w:tcMar>
+              <w:top w:type="dxa" w:w="30"/>
+              <w:left w:type="dxa" w:w="70"/>
+              <w:bottom w:type="dxa" w:w="30"/>
+              <w:right w:type="dxa" w:w="70"/>
+            </w:tcMar>
+            <w:vAlign w:val="top"/>
+          </w:tcPr>
+          <w:p>
+            <w:pPr>
+              <w:spacing w:after="0"/>
+            </w:pPr>
+            <w:r>
+              <w:rPr>
+                <w:rFonts w:ascii="Times New Roman" w:cs="Times New Roman" w:eastAsia="Times New Roman" w:hAnsi="Times New Roman"/>
+                <w:sz w:val="15"/>
+                <w:szCs w:val="15"/>
+              </w:rPr>
+              <w:t xml:space="preserve">Adversarial gate</w:t>
+            </w:r>
+          </w:p>
+        </w:tc>
+        <w:tc>
+          <w:tcPr>
+            <w:tcW w:type="dxa" w:w="2850"/>
+            <w:tcBorders>
+              <w:top w:val="none" w:color="FFFFFF" w:sz="0"/>
+              <w:left w:val="none" w:color="FFFFFF" w:sz="0"/>
+              <w:bottom w:val="none" w:color="FFFFFF" w:sz="0"/>
+              <w:right w:val="none" w:color="FFFFFF" w:sz="0"/>
+            </w:tcBorders>
+            <w:tcMar>
+              <w:top w:type="dxa" w:w="30"/>
+              <w:left w:type="dxa" w:w="70"/>
+              <w:bottom w:type="dxa" w:w="30"/>
+              <w:right w:type="dxa" w:w="70"/>
+            </w:tcMar>
+            <w:vAlign w:val="top"/>
+          </w:tcPr>
+          <w:p>
+            <w:pPr>
+              <w:spacing w:after="0"/>
+            </w:pPr>
+            <w:r>
+              <w:rPr>
+                <w:rFonts w:ascii="Times New Roman" w:cs="Times New Roman" w:eastAsia="Times New Roman" w:hAnsi="Times New Roman"/>
+                <w:sz w:val="15"/>
+                <w:szCs w:val="15"/>
+              </w:rPr>
+              <w:t xml:space="preserve">Each adversarial ticket escalates or proceeds as expected</w:t>
+            </w:r>
+          </w:p>
+        </w:tc>
+        <w:tc>
+          <w:tcPr>
+            <w:tcW w:type="dxa" w:w="850"/>
+            <w:tcBorders>
+              <w:top w:val="none" w:color="FFFFFF" w:sz="0"/>
+              <w:left w:val="none" w:color="FFFFFF" w:sz="0"/>
+              <w:bottom w:val="none" w:color="FFFFFF" w:sz="0"/>
+              <w:right w:val="none" w:color="FFFFFF" w:sz="0"/>
+            </w:tcBorders>
+            <w:tcMar>
+              <w:top w:type="dxa" w:w="30"/>
+              <w:left w:type="dxa" w:w="70"/>
+              <w:bottom w:type="dxa" w:w="30"/>
+              <w:right w:type="dxa" w:w="70"/>
+            </w:tcMar>
+            <w:vAlign w:val="top"/>
+          </w:tcPr>
+          <w:p>
+            <w:pPr>
+              <w:spacing w:after="0"/>
+            </w:pPr>
+            <w:r>
+              <w:rPr>
+                <w:rFonts w:ascii="Times New Roman" w:cs="Times New Roman" w:eastAsia="Times New Roman" w:hAnsi="Times New Roman"/>
+                <w:sz w:val="15"/>
+                <w:szCs w:val="15"/>
+              </w:rPr>
+              <w:t xml:space="preserve">9/9</w:t>
+            </w:r>
+          </w:p>
+        </w:tc>
+      </w:tr>
+      <w:tr>
+        <w:trPr>
+          <w:tblHeader w:val="false"/>
+        </w:trPr>
+        <w:tc>
+          <w:tcPr>
+            <w:tcW w:type="dxa" w:w="1150"/>
+            <w:tcBorders>
+              <w:top w:val="none" w:color="FFFFFF" w:sz="0"/>
+              <w:left w:val="none" w:color="FFFFFF" w:sz="0"/>
+              <w:bottom w:val="none" w:color="FFFFFF" w:sz="0"/>
+              <w:right w:val="none" w:color="FFFFFF" w:sz="0"/>
+            </w:tcBorders>
+            <w:tcMar>
+              <w:top w:type="dxa" w:w="30"/>
+              <w:left w:type="dxa" w:w="70"/>
+              <w:bottom w:type="dxa" w:w="30"/>
+              <w:right w:type="dxa" w:w="70"/>
+            </w:tcMar>
+            <w:vAlign w:val="top"/>
+          </w:tcPr>
+          <w:p>
+            <w:pPr>
+              <w:spacing w:after="0"/>
+            </w:pPr>
+            <w:r>
+              <w:rPr>
+                <w:rFonts w:ascii="Times New Roman" w:cs="Times New Roman" w:eastAsia="Times New Roman" w:hAnsi="Times New Roman"/>
+                <w:sz w:val="15"/>
+                <w:szCs w:val="15"/>
+              </w:rPr>
+              <w:t xml:space="preserve">Gate headroom</w:t>
+            </w:r>
+          </w:p>
+        </w:tc>
+        <w:tc>
+          <w:tcPr>
+            <w:tcW w:type="dxa" w:w="2850"/>
+            <w:tcBorders>
+              <w:top w:val="none" w:color="FFFFFF" w:sz="0"/>
+              <w:left w:val="none" w:color="FFFFFF" w:sz="0"/>
+              <w:bottom w:val="none" w:color="FFFFFF" w:sz="0"/>
+              <w:right w:val="none" w:color="FFFFFF" w:sz="0"/>
+            </w:tcBorders>
+            <w:tcMar>
+              <w:top w:type="dxa" w:w="30"/>
+              <w:left w:type="dxa" w:w="70"/>
+              <w:bottom w:type="dxa" w:w="30"/>
+              <w:right w:type="dxa" w:w="70"/>
+            </w:tcMar>
+            <w:vAlign w:val="top"/>
+          </w:tcPr>
+          <w:p>
+            <w:pPr>
+              <w:spacing w:after="0"/>
+            </w:pPr>
+            <w:r>
+              <w:rPr>
+                <w:rFonts w:ascii="Times New Roman" w:cs="Times New Roman" w:eastAsia="Times New Roman" w:hAnsi="Times New Roman"/>
+                <w:sz w:val="15"/>
+                <w:szCs w:val="15"/>
+              </w:rPr>
+              <w:t xml:space="preserve">No golden similarity lies within its tolerance of the gate; closest, as a multiple of the tolerance</w:t>
+            </w:r>
+          </w:p>
+        </w:tc>
+        <w:tc>
+          <w:tcPr>
+            <w:tcW w:type="dxa" w:w="850"/>
+            <w:tcBorders>
+              <w:top w:val="none" w:color="FFFFFF" w:sz="0"/>
+              <w:left w:val="none" w:color="FFFFFF" w:sz="0"/>
+              <w:bottom w:val="none" w:color="FFFFFF" w:sz="0"/>
+              <w:right w:val="none" w:color="FFFFFF" w:sz="0"/>
+            </w:tcBorders>
+            <w:tcMar>
+              <w:top w:type="dxa" w:w="30"/>
+              <w:left w:type="dxa" w:w="70"/>
+              <w:bottom w:type="dxa" w:w="30"/>
+              <w:right w:type="dxa" w:w="70"/>
+            </w:tcMar>
+            <w:vAlign w:val="top"/>
+          </w:tcPr>
+          <w:p>
+            <w:pPr>
+              <w:spacing w:after="0"/>
+            </w:pPr>
+            <w:r>
+              <w:rPr>
+                <w:rFonts w:ascii="Times New Roman" w:cs="Times New Roman" w:eastAsia="Times New Roman" w:hAnsi="Times New Roman"/>
+                <w:sz w:val="15"/>
+                <w:szCs w:val="15"/>
+              </w:rPr>
+              <w:t xml:space="preserve">3.18×</w:t>
+            </w:r>
+          </w:p>
+        </w:tc>
+      </w:tr>
+      <w:tr>
+        <w:trPr>
+          <w:tblHeader w:val="false"/>
+        </w:trPr>
+        <w:tc>
+          <w:tcPr>
+            <w:tcW w:type="dxa" w:w="1150"/>
+            <w:tcBorders>
+              <w:top w:val="none" w:color="FFFFFF" w:sz="0"/>
+              <w:left w:val="none" w:color="FFFFFF" w:sz="0"/>
+              <w:bottom w:val="none" w:color="FFFFFF" w:sz="0"/>
+              <w:right w:val="none" w:color="FFFFFF" w:sz="0"/>
+            </w:tcBorders>
+            <w:tcMar>
+              <w:top w:type="dxa" w:w="30"/>
+              <w:left w:type="dxa" w:w="70"/>
+              <w:bottom w:type="dxa" w:w="30"/>
+              <w:right w:type="dxa" w:w="70"/>
+            </w:tcMar>
+            <w:vAlign w:val="top"/>
+          </w:tcPr>
+          <w:p>
+            <w:pPr>
+              <w:spacing w:after="0"/>
+            </w:pPr>
+            <w:r>
+              <w:rPr>
+                <w:rFonts w:ascii="Times New Roman" w:cs="Times New Roman" w:eastAsia="Times New Roman" w:hAnsi="Times New Roman"/>
+                <w:sz w:val="15"/>
+                <w:szCs w:val="15"/>
+              </w:rPr>
+              <w:t xml:space="preserve">Artifact guards</w:t>
+            </w:r>
+          </w:p>
+        </w:tc>
+        <w:tc>
+          <w:tcPr>
+            <w:tcW w:type="dxa" w:w="2850"/>
+            <w:tcBorders>
+              <w:top w:val="none" w:color="FFFFFF" w:sz="0"/>
+              <w:left w:val="none" w:color="FFFFFF" w:sz="0"/>
+              <w:bottom w:val="none" w:color="FFFFFF" w:sz="0"/>
+              <w:right w:val="none" w:color="FFFFFF" w:sz="0"/>
+            </w:tcBorders>
+            <w:tcMar>
+              <w:top w:type="dxa" w:w="30"/>
+              <w:left w:type="dxa" w:w="70"/>
+              <w:bottom w:type="dxa" w:w="30"/>
+              <w:right w:type="dxa" w:w="70"/>
+            </w:tcMar>
+            <w:vAlign w:val="top"/>
+          </w:tcPr>
+          <w:p>
+            <w:pPr>
+              <w:spacing w:after="0"/>
+            </w:pPr>
+            <w:r>
+              <w:rPr>
+                <w:rFonts w:ascii="Times New Roman" w:cs="Times New Roman" w:eastAsia="Times New Roman" w:hAnsi="Times New Roman"/>
+                <w:sz w:val="15"/>
+                <w:szCs w:val="15"/>
+              </w:rPr>
+              <w:t xml:space="preserve">Index and metadata aligned; encoder, index and configured dimension agree; Tier 1 matches its dataset and vocabulary</w:t>
+            </w:r>
+          </w:p>
+        </w:tc>
+        <w:tc>
+          <w:tcPr>
+            <w:tcW w:type="dxa" w:w="850"/>
+            <w:tcBorders>
+              <w:top w:val="none" w:color="FFFFFF" w:sz="0"/>
+              <w:left w:val="none" w:color="FFFFFF" w:sz="0"/>
+              <w:bottom w:val="none" w:color="FFFFFF" w:sz="0"/>
+              <w:right w:val="none" w:color="FFFFFF" w:sz="0"/>
+            </w:tcBorders>
+            <w:tcMar>
+              <w:top w:type="dxa" w:w="30"/>
+              <w:left w:type="dxa" w:w="70"/>
+              <w:bottom w:type="dxa" w:w="30"/>
+              <w:right w:type="dxa" w:w="70"/>
+            </w:tcMar>
+            <w:vAlign w:val="top"/>
+          </w:tcPr>
+          <w:p>
+            <w:pPr>
+              <w:spacing w:after="0"/>
+            </w:pPr>
+            <w:r>
+              <w:rPr>
+                <w:rFonts w:ascii="Times New Roman" w:cs="Times New Roman" w:eastAsia="Times New Roman" w:hAnsi="Times New Roman"/>
+                <w:sz w:val="15"/>
+                <w:szCs w:val="15"/>
+              </w:rPr>
+              <w:t xml:space="preserve">–</w:t>
+            </w:r>
+          </w:p>
+        </w:tc>
+      </w:tr>
+      <w:tr>
+        <w:trPr>
+          <w:tblHeader w:val="false"/>
+        </w:trPr>
+        <w:tc>
+          <w:tcPr>
+            <w:tcW w:type="dxa" w:w="1150"/>
+            <w:tcBorders>
+              <w:top w:val="none" w:color="FFFFFF" w:sz="0"/>
+              <w:left w:val="none" w:color="FFFFFF" w:sz="0"/>
+              <w:bottom w:val="single" w:color="000000" w:sz="8"/>
+              <w:right w:val="none" w:color="FFFFFF" w:sz="0"/>
+            </w:tcBorders>
+            <w:tcMar>
+              <w:top w:type="dxa" w:w="30"/>
+              <w:left w:type="dxa" w:w="70"/>
+              <w:bottom w:type="dxa" w:w="30"/>
+              <w:right w:type="dxa" w:w="70"/>
+            </w:tcMar>
+            <w:vAlign w:val="top"/>
+          </w:tcPr>
+          <w:p>
+            <w:pPr>
+              <w:spacing w:after="0"/>
+            </w:pPr>
+            <w:r>
+              <w:rPr>
+                <w:rFonts w:ascii="Times New Roman" w:cs="Times New Roman" w:eastAsia="Times New Roman" w:hAnsi="Times New Roman"/>
+                <w:sz w:val="15"/>
+                <w:szCs w:val="15"/>
+              </w:rPr>
+              <w:t xml:space="preserve">Paper parity</w:t>
+            </w:r>
+          </w:p>
+        </w:tc>
+        <w:tc>
+          <w:tcPr>
+            <w:tcW w:type="dxa" w:w="2850"/>
+            <w:tcBorders>
+              <w:top w:val="none" w:color="FFFFFF" w:sz="0"/>
+              <w:left w:val="none" w:color="FFFFFF" w:sz="0"/>
+              <w:bottom w:val="single" w:color="000000" w:sz="8"/>
+              <w:right w:val="none" w:color="FFFFFF" w:sz="0"/>
+            </w:tcBorders>
+            <w:tcMar>
+              <w:top w:type="dxa" w:w="30"/>
+              <w:left w:type="dxa" w:w="70"/>
+              <w:bottom w:type="dxa" w:w="30"/>
+              <w:right w:type="dxa" w:w="70"/>
+            </w:tcMar>
+            <w:vAlign w:val="top"/>
+          </w:tcPr>
+          <w:p>
+            <w:pPr>
+              <w:spacing w:after="0"/>
+            </w:pPr>
+            <w:r>
+              <w:rPr>
+                <w:rFonts w:ascii="Times New Roman" w:cs="Times New Roman" w:eastAsia="Times New Roman" w:hAnsi="Times New Roman"/>
+                <w:sz w:val="15"/>
+                <w:szCs w:val="15"/>
+              </w:rPr>
+              <w:t xml:space="preserve">Every quoted number is regenerated from a committed result file, and none is typed by hand</w:t>
+            </w:r>
+          </w:p>
+        </w:tc>
+        <w:tc>
+          <w:tcPr>
+            <w:tcW w:type="dxa" w:w="850"/>
+            <w:tcBorders>
+              <w:top w:val="none" w:color="FFFFFF" w:sz="0"/>
+              <w:left w:val="none" w:color="FFFFFF" w:sz="0"/>
+              <w:bottom w:val="single" w:color="000000" w:sz="8"/>
+              <w:right w:val="none" w:color="FFFFFF" w:sz="0"/>
+            </w:tcBorders>
+            <w:tcMar>
+              <w:top w:type="dxa" w:w="30"/>
+              <w:left w:type="dxa" w:w="70"/>
+              <w:bottom w:type="dxa" w:w="30"/>
+              <w:right w:type="dxa" w:w="70"/>
+            </w:tcMar>
+            <w:vAlign w:val="top"/>
+          </w:tcPr>
+          <w:p>
+            <w:pPr>
+              <w:spacing w:after="0"/>
+            </w:pPr>
+            <w:r>
+              <w:rPr>
+                <w:rFonts w:ascii="Times New Roman" w:cs="Times New Roman" w:eastAsia="Times New Roman" w:hAnsi="Times New Roman"/>
+                <w:sz w:val="15"/>
+                <w:szCs w:val="15"/>
+              </w:rPr>
+              <w:t xml:space="preserve">–</w:t>
+            </w:r>
+          </w:p>
+        </w:tc>
+      </w:tr>
+    </w:tbl>
+    <w:p>
+      <w:pPr>
+        <w:spacing w:after="60"/>
+      </w:pPr>
+    </w:p>
+    <w:p>
+      <w:pPr>
+        <w:spacing w:after="100" w:before="200"/>
+        <w:jc w:val="center"/>
+      </w:pPr>
+      <w:r>
+        <w:rPr>
+          <w:rFonts w:ascii="Times New Roman" w:cs="Times New Roman" w:eastAsia="Times New Roman" w:hAnsi="Times New Roman"/>
+          <w:smallCaps/>
+          <w:sz w:val="20"/>
+          <w:szCs w:val="20"/>
+        </w:rPr>
+        <w:t xml:space="preserve">Appendix F: Methodological Lessons</w:t>
+      </w:r>
+    </w:p>
+    <w:p>
+      <w:pPr>
+        <w:spacing w:after="0" w:line="228"/>
+        <w:ind w:firstLine="245"/>
+        <w:jc w:val="both"/>
+      </w:pPr>
+      <w:r>
+        <w:rPr>
+          <w:rFonts w:ascii="Times New Roman" w:cs="Times New Roman" w:eastAsia="Times New Roman" w:hAnsi="Times New Roman"/>
+          <w:b/>
+          <w:bCs/>
+          <w:sz w:val="20"/>
+          <w:szCs w:val="20"/>
+        </w:rPr>
+        <w:t xml:space="preserve">Methodological lessons.</w:t>
+      </w:r>
+      <w:r>
+        <w:rPr>
+          <w:rFonts w:ascii="Times New Roman" w:cs="Times New Roman" w:eastAsia="Times New Roman" w:hAnsi="Times New Roman"/>
+          <w:sz w:val="20"/>
+          <w:szCs w:val="20"/>
+        </w:rPr>
+        <w:t xml:space="preserve"> An area-under-the-risk–coverage metric showed effects that the pre-registered comparison at the live operating coverage could not resolve, so an averaged metric alone is not a reason to adopt a deferral rule. A pre-registered degeneracy rule blocked our paraphrase-shift experiment, and we kept the rule after seeing the results even though a critique of it was reasonable. On nine occasions a value or artifact was wrong for its context yet internally consistent and silently produced a wrong result; each case is documented in the repository.</w:t>
+      </w:r>
+    </w:p>
     <w:sectPr>
       <w:type w:val="continuous"/>
       <w:pgSz w:w="11906" w:h="16838" w:orient="portrait"/>

</xml_diff>

<commit_message>
Paper revision: contribution 4 and abstract wording in v4
- Section I: contribution 4, "An extended evaluation on 108 tickets
  written and cross-labelled by two authors (kappa = 0.936) and 583 real
  tickets from a public dataset, reported with its negative result."
  Numbers read from the result files; bold lead as in items 1-3.
- Abstract: "(119 of all 984)" -> "(12.1% over all 984 tickets)"; to stay
  at 240 words, "so it is reported as a baseline" -> "so it serves as a
  baseline".
- Still 9 pages in Word. v3 unchanged. 456 tests pass.

Co-Authored-By: Claude Opus 5.5 <noreply@anthropic.com>
</commit_message>
<xml_diff>
--- a/paper_docx/Calibrated_Escalation_IT_Ticket_Triage_v4.docx
+++ b/paper_docx/Calibrated_Escalation_IT_Ticket_Triage_v4.docx
@@ -178,7 +178,7 @@
           <w:sz w:val="18"/>
           <w:szCs w:val="18"/>
         </w:rPr>
-        <w:t xml:space="preserve">A triage system for IT support tickets must route each ticket to the right team and recognise when to hand it to a person. Our pipeline has two separately calibrated escalation gates: a 0.50 confidence threshold on a fast lexical classifier decides whether a slower embedding classifier is consulted, and a 0.67 cosine-similarity threshold on retrieved past tickets decides whether a language model may draft a resolution. On a 9-ticket adversarial set the retrieval gate decides every ticket correctly, against 3 of 9 without it. A zero-shot LLM classifies more accurately (40/45 against 33/45) but cannot abstain, so it is reported as a baseline. On 108 tickets written and cross-labelled by two authors (κ = 0.936), the cascade routes 74 of 98 correctly, but the retrieval gate also escalates 32 actionable tickets. On 583 distinct real tickets from a public dataset, covering two of seven teams, it routes 19.7% correctly (119 of all 984), indistinguishable from Tier 2 alone (p = 1.0), or 50.4% under an alternative category mapping; Tier 1 answers 238 of them with 39 correct, and 371 of 468 misrouted tickets still reach the drafter. One pattern repeats across experiments: the data a component is trained or calibrated on limits it more than the method chosen, and a classifier trained only on synthetic templates does not transfer to real tickets. We report negative results, an error analysis and reproduction steps; conclusions are scoped to small evaluation sets.</w:t>
+        <w:t xml:space="preserve">A triage system for IT support tickets must route each ticket to the right team and recognise when to hand it to a person. Our pipeline has two separately calibrated escalation gates: a 0.50 confidence threshold on a fast lexical classifier decides whether a slower embedding classifier is consulted, and a 0.67 cosine-similarity threshold on retrieved past tickets decides whether a language model may draft a resolution. On a 9-ticket adversarial set the retrieval gate decides every ticket correctly, against 3 of 9 without it. A zero-shot LLM classifies more accurately (40/45 against 33/45) but cannot abstain, so it serves as a baseline. On 108 tickets written and cross-labelled by two authors (κ = 0.936), the cascade routes 74 of 98 correctly, but the retrieval gate also escalates 32 actionable tickets. On 583 distinct real tickets from a public dataset, covering two of seven teams, it routes 19.7% correctly (12.1% over all 984 tickets), indistinguishable from Tier 2 alone (p = 1.0), or 50.4% under an alternative category mapping; Tier 1 answers 238 of them with 39 correct, and 371 of 468 misrouted tickets still reach the drafter. One pattern repeats across experiments: the data a component is trained or calibrated on limits it more than the method chosen, and a classifier trained only on synthetic templates does not transfer to real tickets. We report negative results, an error analysis and reproduction steps; conclusions are scoped to small evaluation sets.</w:t>
       </w:r>
     </w:p>
     <w:p>
@@ -374,6 +374,35 @@
           <w:szCs w:val="20"/>
         </w:rPr>
         <w:t xml:space="preserve"> a controlled ablation showing that the cascade saves latency rather than accuracy, zero-shot LLM baselines from two vendors, an audit of an LLM judge, and a breakdown of misclassifications, wrong escalations and unsupported drafts.</w:t>
+      </w:r>
+    </w:p>
+    <w:p>
+      <w:pPr>
+        <w:pStyle w:val="ListParagraph"/>
+        <w:numPr>
+          <w:ilvl w:val="0"/>
+          <w:numId w:val="2"/>
+        </w:numPr>
+        <w:spacing w:after="20" w:line="228"/>
+        <w:jc w:val="both"/>
+      </w:pPr>
+      <w:r>
+        <w:rPr>
+          <w:rFonts w:ascii="Times New Roman" w:cs="Times New Roman" w:eastAsia="Times New Roman" w:hAnsi="Times New Roman"/>
+          <w:b/>
+          <w:bCs/>
+          <w:sz w:val="20"/>
+          <w:szCs w:val="20"/>
+        </w:rPr>
+        <w:t xml:space="preserve">An extended evaluation</w:t>
+      </w:r>
+      <w:r>
+        <w:rPr>
+          <w:rFonts w:ascii="Times New Roman" w:cs="Times New Roman" w:eastAsia="Times New Roman" w:hAnsi="Times New Roman"/>
+          <w:sz w:val="20"/>
+          <w:szCs w:val="20"/>
+        </w:rPr>
+        <w:t xml:space="preserve"> on 108 tickets written and cross-labelled by two authors (κ = 0.936) and 583 real tickets from a public dataset, reported with its negative result.</w:t>
       </w:r>
     </w:p>
     <w:p>

</xml_diff>